<commit_message>
Correcciones mínimas en el docx
</commit_message>
<xml_diff>
--- a/Tarea de gestion de errores y excepciones.docx
+++ b/Tarea de gestion de errores y excepciones.docx
@@ -124,29 +124,7 @@
                 <w:szCs w:val="20"/>
                 <w:lang w:val="en-GB"/>
               </w:rPr>
-              <w:t xml:space="preserve"> </w:t>
-            </w:r>
-            <w:proofErr w:type="gramStart"/>
-            <w:r>
-              <w:rPr>
-                <w:rFonts w:ascii="Courier New" w:eastAsia="Courier New" w:hAnsi="Courier New" w:cs="Courier New"/>
-                <w:color w:val="000000"/>
-                <w:sz w:val="20"/>
-                <w:szCs w:val="20"/>
-                <w:lang w:val="en-GB"/>
-              </w:rPr>
-              <w:t>java.io.FileWriter</w:t>
-            </w:r>
-            <w:proofErr w:type="gramEnd"/>
-            <w:r>
-              <w:rPr>
-                <w:rFonts w:ascii="Courier New" w:eastAsia="Courier New" w:hAnsi="Courier New" w:cs="Courier New"/>
-                <w:color w:val="000000"/>
-                <w:sz w:val="20"/>
-                <w:szCs w:val="20"/>
-                <w:lang w:val="en-GB"/>
-              </w:rPr>
-              <w:t>;</w:t>
+              <w:t xml:space="preserve"> java.io.FileWriter;</w:t>
             </w:r>
           </w:p>
           <w:p>
@@ -180,29 +158,7 @@
                 <w:szCs w:val="20"/>
                 <w:lang w:val="en-GB"/>
               </w:rPr>
-              <w:t xml:space="preserve"> </w:t>
-            </w:r>
-            <w:proofErr w:type="gramStart"/>
-            <w:r>
-              <w:rPr>
-                <w:rFonts w:ascii="Courier New" w:eastAsia="Courier New" w:hAnsi="Courier New" w:cs="Courier New"/>
-                <w:color w:val="000000"/>
-                <w:sz w:val="20"/>
-                <w:szCs w:val="20"/>
-                <w:lang w:val="en-GB"/>
-              </w:rPr>
-              <w:t>java.io.IOException</w:t>
-            </w:r>
-            <w:proofErr w:type="gramEnd"/>
-            <w:r>
-              <w:rPr>
-                <w:rFonts w:ascii="Courier New" w:eastAsia="Courier New" w:hAnsi="Courier New" w:cs="Courier New"/>
-                <w:color w:val="000000"/>
-                <w:sz w:val="20"/>
-                <w:szCs w:val="20"/>
-                <w:lang w:val="en-GB"/>
-              </w:rPr>
-              <w:t>;</w:t>
+              <w:t xml:space="preserve"> java.io.IOException;</w:t>
             </w:r>
           </w:p>
           <w:p>
@@ -236,29 +192,7 @@
                 <w:szCs w:val="20"/>
                 <w:lang w:val="en-GB"/>
               </w:rPr>
-              <w:t xml:space="preserve"> </w:t>
-            </w:r>
-            <w:proofErr w:type="gramStart"/>
-            <w:r>
-              <w:rPr>
-                <w:rFonts w:ascii="Courier New" w:eastAsia="Courier New" w:hAnsi="Courier New" w:cs="Courier New"/>
-                <w:color w:val="000000"/>
-                <w:sz w:val="20"/>
-                <w:szCs w:val="20"/>
-                <w:lang w:val="en-GB"/>
-              </w:rPr>
-              <w:t>java.io.PrintWriter</w:t>
-            </w:r>
-            <w:proofErr w:type="gramEnd"/>
-            <w:r>
-              <w:rPr>
-                <w:rFonts w:ascii="Courier New" w:eastAsia="Courier New" w:hAnsi="Courier New" w:cs="Courier New"/>
-                <w:color w:val="000000"/>
-                <w:sz w:val="20"/>
-                <w:szCs w:val="20"/>
-                <w:lang w:val="en-GB"/>
-              </w:rPr>
-              <w:t>;</w:t>
+              <w:t xml:space="preserve"> java.io.PrintWriter;</w:t>
             </w:r>
           </w:p>
           <w:p>
@@ -410,29 +344,7 @@
                 <w:szCs w:val="20"/>
                 <w:lang w:val="en-GB"/>
               </w:rPr>
-              <w:t xml:space="preserve"> </w:t>
-            </w:r>
-            <w:proofErr w:type="gramStart"/>
-            <w:r>
-              <w:rPr>
-                <w:rFonts w:ascii="Courier New" w:eastAsia="Courier New" w:hAnsi="Courier New" w:cs="Courier New"/>
-                <w:color w:val="000000"/>
-                <w:sz w:val="20"/>
-                <w:szCs w:val="20"/>
-                <w:lang w:val="en-GB"/>
-              </w:rPr>
-              <w:t>main(String[</w:t>
-            </w:r>
-            <w:proofErr w:type="gramEnd"/>
-            <w:r>
-              <w:rPr>
-                <w:rFonts w:ascii="Courier New" w:eastAsia="Courier New" w:hAnsi="Courier New" w:cs="Courier New"/>
-                <w:color w:val="000000"/>
-                <w:sz w:val="20"/>
-                <w:szCs w:val="20"/>
-                <w:lang w:val="en-GB"/>
-              </w:rPr>
-              <w:t xml:space="preserve">] </w:t>
+              <w:t xml:space="preserve"> main(String[] </w:t>
             </w:r>
             <w:r>
               <w:rPr>
@@ -713,29 +625,7 @@
                 <w:szCs w:val="20"/>
                 <w:lang w:val="en-GB"/>
               </w:rPr>
-              <w:t xml:space="preserve"> </w:t>
-            </w:r>
-            <w:proofErr w:type="gramStart"/>
-            <w:r>
-              <w:rPr>
-                <w:rFonts w:ascii="Courier New" w:eastAsia="Courier New" w:hAnsi="Courier New" w:cs="Courier New"/>
-                <w:color w:val="000000"/>
-                <w:sz w:val="20"/>
-                <w:szCs w:val="20"/>
-                <w:lang w:val="en-GB"/>
-              </w:rPr>
-              <w:t>uncaughtException(</w:t>
-            </w:r>
-            <w:proofErr w:type="gramEnd"/>
-            <w:r>
-              <w:rPr>
-                <w:rFonts w:ascii="Courier New" w:eastAsia="Courier New" w:hAnsi="Courier New" w:cs="Courier New"/>
-                <w:color w:val="000000"/>
-                <w:sz w:val="20"/>
-                <w:szCs w:val="20"/>
-                <w:lang w:val="en-GB"/>
-              </w:rPr>
-              <w:t xml:space="preserve">Thread </w:t>
+              <w:t xml:space="preserve"> uncaughtException(Thread </w:t>
             </w:r>
             <w:r>
               <w:rPr>
@@ -860,20 +750,8 @@
                 <w:szCs w:val="20"/>
                 <w:lang w:val="en-GB"/>
               </w:rPr>
-              <w:t xml:space="preserve"> </w:t>
-            </w:r>
-            <w:proofErr w:type="gramStart"/>
-            <w:r>
-              <w:rPr>
-                <w:rFonts w:ascii="Courier New" w:eastAsia="Courier New" w:hAnsi="Courier New" w:cs="Courier New"/>
-                <w:color w:val="000000"/>
-                <w:sz w:val="20"/>
-                <w:szCs w:val="20"/>
-                <w:lang w:val="en-GB"/>
-              </w:rPr>
-              <w:t>PrintWriter(</w:t>
-            </w:r>
-            <w:proofErr w:type="gramEnd"/>
+              <w:t xml:space="preserve"> PrintWriter(</w:t>
+            </w:r>
           </w:p>
           <w:p>
             <w:pPr>
@@ -906,20 +784,8 @@
                 <w:szCs w:val="20"/>
                 <w:lang w:val="en-GB"/>
               </w:rPr>
-              <w:t xml:space="preserve"> </w:t>
-            </w:r>
-            <w:proofErr w:type="gramStart"/>
-            <w:r>
-              <w:rPr>
-                <w:rFonts w:ascii="Courier New" w:eastAsia="Courier New" w:hAnsi="Courier New" w:cs="Courier New"/>
-                <w:color w:val="000000"/>
-                <w:sz w:val="20"/>
-                <w:szCs w:val="20"/>
-                <w:lang w:val="en-GB"/>
-              </w:rPr>
-              <w:t>FileWriter(</w:t>
-            </w:r>
-            <w:proofErr w:type="gramEnd"/>
+              <w:t xml:space="preserve"> FileWriter(</w:t>
+            </w:r>
             <w:r>
               <w:rPr>
                 <w:rFonts w:ascii="Courier New" w:eastAsia="Courier New" w:hAnsi="Courier New" w:cs="Courier New"/>
@@ -982,7 +848,6 @@
                 <w:szCs w:val="20"/>
               </w:rPr>
             </w:pPr>
-            <w:proofErr w:type="gramStart"/>
             <w:r>
               <w:rPr>
                 <w:rFonts w:ascii="Courier New" w:eastAsia="Courier New" w:hAnsi="Courier New" w:cs="Courier New"/>
@@ -999,17 +864,7 @@
                 <w:sz w:val="20"/>
                 <w:szCs w:val="20"/>
               </w:rPr>
-              <w:t>.println</w:t>
-            </w:r>
-            <w:proofErr w:type="gramEnd"/>
-            <w:r>
-              <w:rPr>
-                <w:rFonts w:ascii="Courier New" w:eastAsia="Courier New" w:hAnsi="Courier New" w:cs="Courier New"/>
-                <w:color w:val="000000"/>
-                <w:sz w:val="20"/>
-                <w:szCs w:val="20"/>
-              </w:rPr>
-              <w:t>(</w:t>
+              <w:t>.println(</w:t>
             </w:r>
             <w:r>
               <w:rPr>
@@ -1040,7 +895,6 @@
                 <w:szCs w:val="20"/>
               </w:rPr>
             </w:pPr>
-            <w:proofErr w:type="gramStart"/>
             <w:r>
               <w:rPr>
                 <w:rFonts w:ascii="Courier New" w:eastAsia="Courier New" w:hAnsi="Courier New" w:cs="Courier New"/>
@@ -1057,17 +911,7 @@
                 <w:sz w:val="20"/>
                 <w:szCs w:val="20"/>
               </w:rPr>
-              <w:t>.println</w:t>
-            </w:r>
-            <w:proofErr w:type="gramEnd"/>
-            <w:r>
-              <w:rPr>
-                <w:rFonts w:ascii="Courier New" w:eastAsia="Courier New" w:hAnsi="Courier New" w:cs="Courier New"/>
-                <w:color w:val="000000"/>
-                <w:sz w:val="20"/>
-                <w:szCs w:val="20"/>
-              </w:rPr>
-              <w:t>(</w:t>
+              <w:t>.println(</w:t>
             </w:r>
             <w:r>
               <w:rPr>
@@ -1099,7 +943,6 @@
                 <w:lang w:val="en-GB"/>
               </w:rPr>
             </w:pPr>
-            <w:proofErr w:type="gramStart"/>
             <w:r>
               <w:rPr>
                 <w:rFonts w:ascii="Courier New" w:eastAsia="Courier New" w:hAnsi="Courier New" w:cs="Courier New"/>
@@ -1118,18 +961,7 @@
                 <w:szCs w:val="20"/>
                 <w:lang w:val="en-GB"/>
               </w:rPr>
-              <w:t>.println</w:t>
-            </w:r>
-            <w:proofErr w:type="gramEnd"/>
-            <w:r>
-              <w:rPr>
-                <w:rFonts w:ascii="Courier New" w:eastAsia="Courier New" w:hAnsi="Courier New" w:cs="Courier New"/>
-                <w:color w:val="000000"/>
-                <w:sz w:val="20"/>
-                <w:szCs w:val="20"/>
-                <w:lang w:val="en-GB"/>
-              </w:rPr>
-              <w:t>(</w:t>
+              <w:t>.println(</w:t>
             </w:r>
             <w:r>
               <w:rPr>
@@ -1151,7 +983,6 @@
               </w:rPr>
               <w:t xml:space="preserve"> + </w:t>
             </w:r>
-            <w:proofErr w:type="gramStart"/>
             <w:r>
               <w:rPr>
                 <w:rFonts w:ascii="Courier New" w:eastAsia="Courier New" w:hAnsi="Courier New" w:cs="Courier New"/>
@@ -1170,32 +1001,20 @@
                 <w:szCs w:val="20"/>
                 <w:lang w:val="en-GB"/>
               </w:rPr>
-              <w:t>.getName</w:t>
-            </w:r>
-            <w:proofErr w:type="gramEnd"/>
-            <w:r>
-              <w:rPr>
-                <w:rFonts w:ascii="Courier New" w:eastAsia="Courier New" w:hAnsi="Courier New" w:cs="Courier New"/>
-                <w:color w:val="000000"/>
-                <w:sz w:val="20"/>
-                <w:szCs w:val="20"/>
-                <w:lang w:val="en-GB"/>
-              </w:rPr>
-              <w:t>());</w:t>
-            </w:r>
-          </w:p>
-          <w:p>
-            <w:pPr>
-              <w:shd w:val="clear" w:color="auto" w:fill="FFFFFF"/>
-              <w:rPr>
-                <w:rFonts w:ascii="Courier New" w:eastAsia="Courier New" w:hAnsi="Courier New" w:cs="Courier New"/>
-                <w:color w:val="000000"/>
-                <w:sz w:val="20"/>
-                <w:szCs w:val="20"/>
-                <w:lang w:val="en-GB"/>
-              </w:rPr>
-            </w:pPr>
-            <w:proofErr w:type="gramStart"/>
+              <w:t>.getName());</w:t>
+            </w:r>
+          </w:p>
+          <w:p>
+            <w:pPr>
+              <w:shd w:val="clear" w:color="auto" w:fill="FFFFFF"/>
+              <w:rPr>
+                <w:rFonts w:ascii="Courier New" w:eastAsia="Courier New" w:hAnsi="Courier New" w:cs="Courier New"/>
+                <w:color w:val="000000"/>
+                <w:sz w:val="20"/>
+                <w:szCs w:val="20"/>
+                <w:lang w:val="en-GB"/>
+              </w:rPr>
+            </w:pPr>
             <w:r>
               <w:rPr>
                 <w:rFonts w:ascii="Courier New" w:eastAsia="Courier New" w:hAnsi="Courier New" w:cs="Courier New"/>
@@ -1214,18 +1033,7 @@
                 <w:szCs w:val="20"/>
                 <w:lang w:val="en-GB"/>
               </w:rPr>
-              <w:t>.println</w:t>
-            </w:r>
-            <w:proofErr w:type="gramEnd"/>
-            <w:r>
-              <w:rPr>
-                <w:rFonts w:ascii="Courier New" w:eastAsia="Courier New" w:hAnsi="Courier New" w:cs="Courier New"/>
-                <w:color w:val="000000"/>
-                <w:sz w:val="20"/>
-                <w:szCs w:val="20"/>
-                <w:lang w:val="en-GB"/>
-              </w:rPr>
-              <w:t>(</w:t>
+              <w:t>.println(</w:t>
             </w:r>
             <w:r>
               <w:rPr>
@@ -1247,7 +1055,6 @@
               </w:rPr>
               <w:t xml:space="preserve"> + </w:t>
             </w:r>
-            <w:proofErr w:type="gramStart"/>
             <w:r>
               <w:rPr>
                 <w:rFonts w:ascii="Courier New" w:eastAsia="Courier New" w:hAnsi="Courier New" w:cs="Courier New"/>
@@ -1266,54 +1073,20 @@
                 <w:szCs w:val="20"/>
                 <w:lang w:val="en-GB"/>
               </w:rPr>
-              <w:t>.getClass</w:t>
-            </w:r>
-            <w:proofErr w:type="gramEnd"/>
-            <w:r>
-              <w:rPr>
-                <w:rFonts w:ascii="Courier New" w:eastAsia="Courier New" w:hAnsi="Courier New" w:cs="Courier New"/>
-                <w:color w:val="000000"/>
-                <w:sz w:val="20"/>
-                <w:szCs w:val="20"/>
-                <w:lang w:val="en-GB"/>
-              </w:rPr>
-              <w:t>(</w:t>
-            </w:r>
-            <w:proofErr w:type="gramStart"/>
-            <w:r>
-              <w:rPr>
-                <w:rFonts w:ascii="Courier New" w:eastAsia="Courier New" w:hAnsi="Courier New" w:cs="Courier New"/>
-                <w:color w:val="000000"/>
-                <w:sz w:val="20"/>
-                <w:szCs w:val="20"/>
-                <w:lang w:val="en-GB"/>
-              </w:rPr>
-              <w:t>).getName</w:t>
-            </w:r>
-            <w:proofErr w:type="gramEnd"/>
-            <w:r>
-              <w:rPr>
-                <w:rFonts w:ascii="Courier New" w:eastAsia="Courier New" w:hAnsi="Courier New" w:cs="Courier New"/>
-                <w:color w:val="000000"/>
-                <w:sz w:val="20"/>
-                <w:szCs w:val="20"/>
-                <w:lang w:val="en-GB"/>
-              </w:rPr>
-              <w:t>());</w:t>
-            </w:r>
-          </w:p>
-          <w:p>
-            <w:pPr>
-              <w:shd w:val="clear" w:color="auto" w:fill="FFFFFF"/>
-              <w:rPr>
-                <w:rFonts w:ascii="Courier New" w:eastAsia="Courier New" w:hAnsi="Courier New" w:cs="Courier New"/>
-                <w:color w:val="000000"/>
-                <w:sz w:val="20"/>
-                <w:szCs w:val="20"/>
-                <w:lang w:val="en-GB"/>
-              </w:rPr>
-            </w:pPr>
-            <w:proofErr w:type="gramStart"/>
+              <w:t>.getClass().getName());</w:t>
+            </w:r>
+          </w:p>
+          <w:p>
+            <w:pPr>
+              <w:shd w:val="clear" w:color="auto" w:fill="FFFFFF"/>
+              <w:rPr>
+                <w:rFonts w:ascii="Courier New" w:eastAsia="Courier New" w:hAnsi="Courier New" w:cs="Courier New"/>
+                <w:color w:val="000000"/>
+                <w:sz w:val="20"/>
+                <w:szCs w:val="20"/>
+                <w:lang w:val="en-GB"/>
+              </w:rPr>
+            </w:pPr>
             <w:r>
               <w:rPr>
                 <w:rFonts w:ascii="Courier New" w:eastAsia="Courier New" w:hAnsi="Courier New" w:cs="Courier New"/>
@@ -1332,18 +1105,7 @@
                 <w:szCs w:val="20"/>
                 <w:lang w:val="en-GB"/>
               </w:rPr>
-              <w:t>.println</w:t>
-            </w:r>
-            <w:proofErr w:type="gramEnd"/>
-            <w:r>
-              <w:rPr>
-                <w:rFonts w:ascii="Courier New" w:eastAsia="Courier New" w:hAnsi="Courier New" w:cs="Courier New"/>
-                <w:color w:val="000000"/>
-                <w:sz w:val="20"/>
-                <w:szCs w:val="20"/>
-                <w:lang w:val="en-GB"/>
-              </w:rPr>
-              <w:t>(</w:t>
+              <w:t>.println(</w:t>
             </w:r>
             <w:r>
               <w:rPr>
@@ -1365,7 +1127,6 @@
               </w:rPr>
               <w:t xml:space="preserve"> + </w:t>
             </w:r>
-            <w:proofErr w:type="gramStart"/>
             <w:r>
               <w:rPr>
                 <w:rFonts w:ascii="Courier New" w:eastAsia="Courier New" w:hAnsi="Courier New" w:cs="Courier New"/>
@@ -1384,41 +1145,29 @@
                 <w:szCs w:val="20"/>
                 <w:lang w:val="en-GB"/>
               </w:rPr>
-              <w:t>.getMessage</w:t>
-            </w:r>
-            <w:proofErr w:type="gramEnd"/>
-            <w:r>
-              <w:rPr>
-                <w:rFonts w:ascii="Courier New" w:eastAsia="Courier New" w:hAnsi="Courier New" w:cs="Courier New"/>
-                <w:color w:val="000000"/>
-                <w:sz w:val="20"/>
-                <w:szCs w:val="20"/>
-                <w:lang w:val="en-GB"/>
-              </w:rPr>
-              <w:t>());</w:t>
-            </w:r>
-          </w:p>
-          <w:p>
-            <w:pPr>
-              <w:shd w:val="clear" w:color="auto" w:fill="FFFFFF"/>
-              <w:rPr>
-                <w:color w:val="000000"/>
-                <w:lang w:val="en-GB"/>
-              </w:rPr>
-            </w:pPr>
-          </w:p>
-          <w:p>
-            <w:pPr>
-              <w:shd w:val="clear" w:color="auto" w:fill="FFFFFF"/>
-              <w:rPr>
-                <w:rFonts w:ascii="Courier New" w:eastAsia="Courier New" w:hAnsi="Courier New" w:cs="Courier New"/>
-                <w:color w:val="000000"/>
-                <w:sz w:val="20"/>
-                <w:szCs w:val="20"/>
-                <w:lang w:val="en-GB"/>
-              </w:rPr>
-            </w:pPr>
-            <w:proofErr w:type="gramStart"/>
+              <w:t>.getMessage());</w:t>
+            </w:r>
+          </w:p>
+          <w:p>
+            <w:pPr>
+              <w:shd w:val="clear" w:color="auto" w:fill="FFFFFF"/>
+              <w:rPr>
+                <w:color w:val="000000"/>
+                <w:lang w:val="en-GB"/>
+              </w:rPr>
+            </w:pPr>
+          </w:p>
+          <w:p>
+            <w:pPr>
+              <w:shd w:val="clear" w:color="auto" w:fill="FFFFFF"/>
+              <w:rPr>
+                <w:rFonts w:ascii="Courier New" w:eastAsia="Courier New" w:hAnsi="Courier New" w:cs="Courier New"/>
+                <w:color w:val="000000"/>
+                <w:sz w:val="20"/>
+                <w:szCs w:val="20"/>
+                <w:lang w:val="en-GB"/>
+              </w:rPr>
+            </w:pPr>
             <w:r>
               <w:rPr>
                 <w:rFonts w:ascii="Courier New" w:eastAsia="Courier New" w:hAnsi="Courier New" w:cs="Courier New"/>
@@ -1437,18 +1186,7 @@
                 <w:szCs w:val="20"/>
                 <w:lang w:val="en-GB"/>
               </w:rPr>
-              <w:t>.printStackTrace</w:t>
-            </w:r>
-            <w:proofErr w:type="gramEnd"/>
-            <w:r>
-              <w:rPr>
-                <w:rFonts w:ascii="Courier New" w:eastAsia="Courier New" w:hAnsi="Courier New" w:cs="Courier New"/>
-                <w:color w:val="000000"/>
-                <w:sz w:val="20"/>
-                <w:szCs w:val="20"/>
-                <w:lang w:val="en-GB"/>
-              </w:rPr>
-              <w:t>(</w:t>
+              <w:t>.printStackTrace(</w:t>
             </w:r>
             <w:r>
               <w:rPr>
@@ -1554,7 +1292,6 @@
                 <w:szCs w:val="20"/>
               </w:rPr>
             </w:pPr>
-            <w:proofErr w:type="gramStart"/>
             <w:r>
               <w:rPr>
                 <w:rFonts w:ascii="Courier New" w:eastAsia="Courier New" w:hAnsi="Courier New" w:cs="Courier New"/>
@@ -1571,17 +1308,7 @@
                 <w:sz w:val="20"/>
                 <w:szCs w:val="20"/>
               </w:rPr>
-              <w:t>.printStackTrace</w:t>
-            </w:r>
-            <w:proofErr w:type="gramEnd"/>
-            <w:r>
-              <w:rPr>
-                <w:rFonts w:ascii="Courier New" w:eastAsia="Courier New" w:hAnsi="Courier New" w:cs="Courier New"/>
-                <w:color w:val="000000"/>
-                <w:sz w:val="20"/>
-                <w:szCs w:val="20"/>
-              </w:rPr>
-              <w:t>();</w:t>
+              <w:t>.printStackTrace();</w:t>
             </w:r>
           </w:p>
           <w:p>
@@ -1750,7 +1477,6 @@
                 <w:szCs w:val="20"/>
               </w:rPr>
             </w:pPr>
-            <w:proofErr w:type="gramStart"/>
             <w:r>
               <w:rPr>
                 <w:rFonts w:ascii="Courier New" w:eastAsia="Courier New" w:hAnsi="Courier New" w:cs="Courier New"/>
@@ -1769,17 +1495,7 @@
                 <w:sz w:val="20"/>
                 <w:szCs w:val="20"/>
               </w:rPr>
-              <w:t>(</w:t>
-            </w:r>
-            <w:proofErr w:type="gramEnd"/>
-            <w:r>
-              <w:rPr>
-                <w:rFonts w:ascii="Courier New" w:eastAsia="Courier New" w:hAnsi="Courier New" w:cs="Courier New"/>
-                <w:color w:val="000000"/>
-                <w:sz w:val="20"/>
-                <w:szCs w:val="20"/>
-              </w:rPr>
-              <w:t>);</w:t>
+              <w:t>();</w:t>
             </w:r>
           </w:p>
           <w:p>
@@ -1956,43 +1672,20 @@
                 <w:szCs w:val="20"/>
                 <w:lang w:val="en-GB"/>
               </w:rPr>
-              <w:t xml:space="preserve"> </w:t>
-            </w:r>
-            <w:proofErr w:type="gramStart"/>
-            <w:r>
-              <w:rPr>
-                <w:rFonts w:ascii="Courier New" w:eastAsia="Courier New" w:hAnsi="Courier New" w:cs="Courier New"/>
-                <w:color w:val="000000"/>
-                <w:sz w:val="20"/>
-                <w:szCs w:val="20"/>
-                <w:lang w:val="en-GB"/>
-              </w:rPr>
-              <w:t>provocarStackOverflow(</w:t>
-            </w:r>
-            <w:proofErr w:type="gramEnd"/>
-            <w:r>
-              <w:rPr>
-                <w:rFonts w:ascii="Courier New" w:eastAsia="Courier New" w:hAnsi="Courier New" w:cs="Courier New"/>
-                <w:color w:val="000000"/>
-                <w:sz w:val="20"/>
-                <w:szCs w:val="20"/>
-                <w:lang w:val="en-GB"/>
-              </w:rPr>
-              <w:t>) {</w:t>
-            </w:r>
-          </w:p>
-          <w:p>
-            <w:pPr>
-              <w:shd w:val="clear" w:color="auto" w:fill="FFFFFF"/>
-              <w:rPr>
-                <w:rFonts w:ascii="Courier New" w:eastAsia="Courier New" w:hAnsi="Courier New" w:cs="Courier New"/>
-                <w:color w:val="000000"/>
-                <w:sz w:val="20"/>
-                <w:szCs w:val="20"/>
-                <w:lang w:val="en-GB"/>
-              </w:rPr>
-            </w:pPr>
-            <w:proofErr w:type="gramStart"/>
+              <w:t xml:space="preserve"> provocarStackOverflow() {</w:t>
+            </w:r>
+          </w:p>
+          <w:p>
+            <w:pPr>
+              <w:shd w:val="clear" w:color="auto" w:fill="FFFFFF"/>
+              <w:rPr>
+                <w:rFonts w:ascii="Courier New" w:eastAsia="Courier New" w:hAnsi="Courier New" w:cs="Courier New"/>
+                <w:color w:val="000000"/>
+                <w:sz w:val="20"/>
+                <w:szCs w:val="20"/>
+                <w:lang w:val="en-GB"/>
+              </w:rPr>
+            </w:pPr>
             <w:r>
               <w:rPr>
                 <w:rFonts w:ascii="Courier New" w:eastAsia="Courier New" w:hAnsi="Courier New" w:cs="Courier New"/>
@@ -2013,18 +1706,7 @@
                 <w:szCs w:val="20"/>
                 <w:lang w:val="en-GB"/>
               </w:rPr>
-              <w:t>(</w:t>
-            </w:r>
-            <w:proofErr w:type="gramEnd"/>
-            <w:r>
-              <w:rPr>
-                <w:rFonts w:ascii="Courier New" w:eastAsia="Courier New" w:hAnsi="Courier New" w:cs="Courier New"/>
-                <w:color w:val="000000"/>
-                <w:sz w:val="20"/>
-                <w:szCs w:val="20"/>
-                <w:lang w:val="en-GB"/>
-              </w:rPr>
-              <w:t>);</w:t>
+              <w:t>();</w:t>
             </w:r>
           </w:p>
           <w:p>
@@ -2178,6 +1860,14 @@
       </w:pPr>
       <w:r>
         <w:t>Ejercicio 2</w:t>
+      </w:r>
+    </w:p>
+    <w:p>
+      <w:r>
+        <w:t>Haz un ejemplo que contemple NullPointerException</w:t>
+      </w:r>
+      <w:r>
+        <w:t>:</w:t>
       </w:r>
     </w:p>
     <w:p>
@@ -2434,6 +2124,7 @@
         <w:rPr>
           <w:color w:val="000000"/>
         </w:rPr>
+        <w:lastRenderedPageBreak/>
         <w:t>Y controlar correctamente:</w:t>
       </w:r>
     </w:p>
@@ -2460,7 +2151,6 @@
           <w:rFonts w:ascii="Consolas" w:eastAsia="Consolas" w:hAnsi="Consolas" w:cs="Consolas"/>
           <w:color w:val="000000"/>
         </w:rPr>
-        <w:lastRenderedPageBreak/>
         <w:t>ArithmeticException</w:t>
       </w:r>
       <w:r>
@@ -2553,21 +2243,7 @@
               <w:rPr>
                 <w:color w:val="000000"/>
               </w:rPr>
-              <w:t xml:space="preserve">import </w:t>
-            </w:r>
-            <w:proofErr w:type="gramStart"/>
-            <w:r>
-              <w:rPr>
-                <w:color w:val="000000"/>
-              </w:rPr>
-              <w:t>java.util</w:t>
-            </w:r>
-            <w:proofErr w:type="gramEnd"/>
-            <w:r>
-              <w:rPr>
-                <w:color w:val="000000"/>
-              </w:rPr>
-              <w:t>.Scanner;</w:t>
+              <w:t>import java.util.Scanner;</w:t>
             </w:r>
           </w:p>
           <w:p>
@@ -2621,23 +2297,7 @@
                 <w:color w:val="000000"/>
                 <w:lang w:val="en-GB"/>
               </w:rPr>
-              <w:t xml:space="preserve">    public static void </w:t>
-            </w:r>
-            <w:proofErr w:type="gramStart"/>
-            <w:r>
-              <w:rPr>
-                <w:color w:val="000000"/>
-                <w:lang w:val="en-GB"/>
-              </w:rPr>
-              <w:t>main(String[</w:t>
-            </w:r>
-            <w:proofErr w:type="gramEnd"/>
-            <w:r>
-              <w:rPr>
-                <w:color w:val="000000"/>
-                <w:lang w:val="en-GB"/>
-              </w:rPr>
-              <w:t>] args) {</w:t>
+              <w:t xml:space="preserve">    public static void main(String[] args) {</w:t>
             </w:r>
           </w:p>
           <w:p>
@@ -2697,53 +2357,779 @@
                 <w:color w:val="000000"/>
                 <w:lang w:val="en-GB"/>
               </w:rPr>
+              <w:t xml:space="preserve">            controlador();</w:t>
+            </w:r>
+          </w:p>
+          <w:p>
+            <w:pPr>
+              <w:rPr>
+                <w:color w:val="000000"/>
+                <w:lang w:val="en-GB"/>
+              </w:rPr>
+            </w:pPr>
+            <w:r>
+              <w:rPr>
+                <w:color w:val="000000"/>
+                <w:lang w:val="en-GB"/>
+              </w:rPr>
+              <w:t xml:space="preserve"> </w:t>
+            </w:r>
+          </w:p>
+          <w:p>
+            <w:pPr>
+              <w:rPr>
+                <w:color w:val="000000"/>
+                <w:lang w:val="en-GB"/>
+              </w:rPr>
+            </w:pPr>
+            <w:r>
+              <w:rPr>
+                <w:color w:val="000000"/>
+                <w:lang w:val="en-GB"/>
+              </w:rPr>
+              <w:t xml:space="preserve">        } catch (RuntimeException e) {</w:t>
+            </w:r>
+          </w:p>
+          <w:p>
+            <w:pPr>
+              <w:rPr>
+                <w:color w:val="000000"/>
+                <w:lang w:val="en-GB"/>
+              </w:rPr>
+            </w:pPr>
+            <w:r>
+              <w:rPr>
+                <w:color w:val="000000"/>
+                <w:lang w:val="en-GB"/>
+              </w:rPr>
+              <w:t xml:space="preserve"> </w:t>
+            </w:r>
+          </w:p>
+          <w:p>
+            <w:pPr>
+              <w:rPr>
+                <w:color w:val="000000"/>
+              </w:rPr>
+            </w:pPr>
+            <w:r>
+              <w:rPr>
+                <w:color w:val="000000"/>
+                <w:lang w:val="en-GB"/>
+              </w:rPr>
               <w:t xml:space="preserve">            </w:t>
             </w:r>
-            <w:proofErr w:type="gramStart"/>
-            <w:r>
-              <w:rPr>
-                <w:color w:val="000000"/>
-                <w:lang w:val="en-GB"/>
-              </w:rPr>
-              <w:t>controlador(</w:t>
-            </w:r>
-            <w:proofErr w:type="gramEnd"/>
-            <w:r>
-              <w:rPr>
-                <w:color w:val="000000"/>
-                <w:lang w:val="en-GB"/>
-              </w:rPr>
-              <w:t>);</w:t>
-            </w:r>
-          </w:p>
-          <w:p>
-            <w:pPr>
-              <w:rPr>
-                <w:color w:val="000000"/>
-                <w:lang w:val="en-GB"/>
-              </w:rPr>
-            </w:pPr>
-            <w:r>
-              <w:rPr>
-                <w:color w:val="000000"/>
-                <w:lang w:val="en-GB"/>
-              </w:rPr>
-              <w:t xml:space="preserve"> </w:t>
-            </w:r>
-          </w:p>
-          <w:p>
-            <w:pPr>
-              <w:rPr>
-                <w:color w:val="000000"/>
-                <w:lang w:val="en-GB"/>
-              </w:rPr>
-            </w:pPr>
-            <w:r>
-              <w:rPr>
-                <w:color w:val="000000"/>
-                <w:lang w:val="en-GB"/>
-              </w:rPr>
-              <w:t xml:space="preserve">        } catch (RuntimeException e) {</w:t>
+            <w:r>
+              <w:rPr>
+                <w:color w:val="000000"/>
+              </w:rPr>
+              <w:t>manejarExcepcion(e);</w:t>
+            </w:r>
+          </w:p>
+          <w:p>
+            <w:pPr>
+              <w:rPr>
+                <w:color w:val="000000"/>
+              </w:rPr>
+            </w:pPr>
+            <w:r>
+              <w:rPr>
+                <w:color w:val="000000"/>
+              </w:rPr>
+              <w:t xml:space="preserve">        }</w:t>
+            </w:r>
+          </w:p>
+          <w:p>
+            <w:pPr>
+              <w:rPr>
+                <w:color w:val="000000"/>
+              </w:rPr>
+            </w:pPr>
+            <w:r>
+              <w:rPr>
+                <w:color w:val="000000"/>
+              </w:rPr>
+              <w:t xml:space="preserve"> </w:t>
+            </w:r>
+          </w:p>
+          <w:p>
+            <w:pPr>
+              <w:rPr>
+                <w:color w:val="000000"/>
+              </w:rPr>
+            </w:pPr>
+            <w:r>
+              <w:rPr>
+                <w:color w:val="000000"/>
+              </w:rPr>
+              <w:t xml:space="preserve">        System.out.println("Aplicación terminada");</w:t>
+            </w:r>
+          </w:p>
+          <w:p>
+            <w:pPr>
+              <w:rPr>
+                <w:color w:val="000000"/>
+              </w:rPr>
+            </w:pPr>
+            <w:r>
+              <w:rPr>
+                <w:color w:val="000000"/>
+              </w:rPr>
+              <w:t xml:space="preserve">    }</w:t>
+            </w:r>
+          </w:p>
+          <w:p>
+            <w:pPr>
+              <w:rPr>
+                <w:color w:val="000000"/>
+              </w:rPr>
+            </w:pPr>
+            <w:r>
+              <w:rPr>
+                <w:color w:val="000000"/>
+              </w:rPr>
+              <w:t xml:space="preserve"> </w:t>
+            </w:r>
+          </w:p>
+          <w:p>
+            <w:pPr>
+              <w:rPr>
+                <w:color w:val="000000"/>
+              </w:rPr>
+            </w:pPr>
+            <w:r>
+              <w:rPr>
+                <w:color w:val="000000"/>
+              </w:rPr>
+              <w:t xml:space="preserve">    // Simula un controlador (capa del controlador)</w:t>
+            </w:r>
+          </w:p>
+          <w:p>
+            <w:pPr>
+              <w:rPr>
+                <w:color w:val="000000"/>
+              </w:rPr>
+            </w:pPr>
+            <w:r>
+              <w:rPr>
+                <w:color w:val="000000"/>
+              </w:rPr>
+              <w:t xml:space="preserve">    public static void controlador() {</w:t>
+            </w:r>
+          </w:p>
+          <w:p>
+            <w:pPr>
+              <w:rPr>
+                <w:color w:val="000000"/>
+              </w:rPr>
+            </w:pPr>
+            <w:r>
+              <w:rPr>
+                <w:color w:val="000000"/>
+              </w:rPr>
+              <w:t xml:space="preserve"> </w:t>
+            </w:r>
+          </w:p>
+          <w:p>
+            <w:pPr>
+              <w:rPr>
+                <w:color w:val="000000"/>
+              </w:rPr>
+            </w:pPr>
+            <w:r>
+              <w:rPr>
+                <w:color w:val="000000"/>
+              </w:rPr>
+              <w:t xml:space="preserve">        System.out.println("Controlador: recibo la petición");</w:t>
+            </w:r>
+          </w:p>
+          <w:p>
+            <w:pPr>
+              <w:rPr>
+                <w:color w:val="000000"/>
+              </w:rPr>
+            </w:pPr>
+            <w:r>
+              <w:rPr>
+                <w:color w:val="000000"/>
+              </w:rPr>
+              <w:t xml:space="preserve"> </w:t>
+            </w:r>
+          </w:p>
+          <w:p>
+            <w:pPr>
+              <w:rPr>
+                <w:color w:val="000000"/>
+              </w:rPr>
+            </w:pPr>
+            <w:r>
+              <w:rPr>
+                <w:color w:val="000000"/>
+              </w:rPr>
+              <w:t xml:space="preserve">        servicio();</w:t>
+            </w:r>
+          </w:p>
+          <w:p>
+            <w:pPr>
+              <w:rPr>
+                <w:color w:val="000000"/>
+              </w:rPr>
+            </w:pPr>
+            <w:r>
+              <w:rPr>
+                <w:color w:val="000000"/>
+              </w:rPr>
+              <w:t xml:space="preserve"> </w:t>
+            </w:r>
+          </w:p>
+          <w:p>
+            <w:pPr>
+              <w:rPr>
+                <w:color w:val="000000"/>
+              </w:rPr>
+            </w:pPr>
+            <w:r>
+              <w:rPr>
+                <w:color w:val="000000"/>
+              </w:rPr>
+              <w:t xml:space="preserve">        System.out.println("Controlador: petición procesada");</w:t>
+            </w:r>
+          </w:p>
+          <w:p>
+            <w:pPr>
+              <w:rPr>
+                <w:color w:val="000000"/>
+              </w:rPr>
+            </w:pPr>
+            <w:r>
+              <w:rPr>
+                <w:color w:val="000000"/>
+              </w:rPr>
+              <w:t xml:space="preserve">    }</w:t>
+            </w:r>
+          </w:p>
+          <w:p>
+            <w:pPr>
+              <w:rPr>
+                <w:color w:val="000000"/>
+              </w:rPr>
+            </w:pPr>
+            <w:r>
+              <w:rPr>
+                <w:color w:val="000000"/>
+              </w:rPr>
+              <w:t xml:space="preserve"> </w:t>
+            </w:r>
+          </w:p>
+          <w:p>
+            <w:pPr>
+              <w:rPr>
+                <w:color w:val="000000"/>
+              </w:rPr>
+            </w:pPr>
+            <w:r>
+              <w:rPr>
+                <w:color w:val="000000"/>
+              </w:rPr>
+              <w:t xml:space="preserve">    // Simula la capa de servicio</w:t>
+            </w:r>
+          </w:p>
+          <w:p>
+            <w:pPr>
+              <w:rPr>
+                <w:color w:val="000000"/>
+              </w:rPr>
+            </w:pPr>
+            <w:r>
+              <w:rPr>
+                <w:color w:val="000000"/>
+              </w:rPr>
+              <w:t xml:space="preserve">    public static void servicio() {</w:t>
+            </w:r>
+          </w:p>
+          <w:p>
+            <w:pPr>
+              <w:rPr>
+                <w:color w:val="000000"/>
+              </w:rPr>
+            </w:pPr>
+            <w:r>
+              <w:rPr>
+                <w:color w:val="000000"/>
+              </w:rPr>
+              <w:t xml:space="preserve"> </w:t>
+            </w:r>
+          </w:p>
+          <w:p>
+            <w:pPr>
+              <w:rPr>
+                <w:color w:val="000000"/>
+              </w:rPr>
+            </w:pPr>
+            <w:r>
+              <w:rPr>
+                <w:color w:val="000000"/>
+              </w:rPr>
+              <w:t xml:space="preserve">        System.out.println("Servicio: voy a realizar el cálculo");</w:t>
+            </w:r>
+          </w:p>
+          <w:p>
+            <w:pPr>
+              <w:rPr>
+                <w:color w:val="000000"/>
+              </w:rPr>
+            </w:pPr>
+            <w:r>
+              <w:rPr>
+                <w:color w:val="000000"/>
+              </w:rPr>
+              <w:t xml:space="preserve"> </w:t>
+            </w:r>
+          </w:p>
+          <w:p>
+            <w:pPr>
+              <w:rPr>
+                <w:color w:val="000000"/>
+              </w:rPr>
+            </w:pPr>
+            <w:r>
+              <w:rPr>
+                <w:color w:val="000000"/>
+              </w:rPr>
+              <w:t xml:space="preserve">        calcular();</w:t>
+            </w:r>
+          </w:p>
+          <w:p>
+            <w:pPr>
+              <w:rPr>
+                <w:color w:val="000000"/>
+              </w:rPr>
+            </w:pPr>
+            <w:r>
+              <w:rPr>
+                <w:color w:val="000000"/>
+              </w:rPr>
+              <w:t xml:space="preserve"> </w:t>
+            </w:r>
+          </w:p>
+          <w:p>
+            <w:pPr>
+              <w:rPr>
+                <w:color w:val="000000"/>
+              </w:rPr>
+            </w:pPr>
+            <w:r>
+              <w:rPr>
+                <w:color w:val="000000"/>
+              </w:rPr>
+              <w:t xml:space="preserve">        System.out.println("Servicio: cálculo terminado");</w:t>
+            </w:r>
+          </w:p>
+          <w:p>
+            <w:pPr>
+              <w:rPr>
+                <w:color w:val="000000"/>
+              </w:rPr>
+            </w:pPr>
+            <w:r>
+              <w:rPr>
+                <w:color w:val="000000"/>
+              </w:rPr>
+              <w:lastRenderedPageBreak/>
+              <w:t xml:space="preserve">    }</w:t>
+            </w:r>
+          </w:p>
+          <w:p>
+            <w:pPr>
+              <w:rPr>
+                <w:color w:val="000000"/>
+              </w:rPr>
+            </w:pPr>
+            <w:r>
+              <w:rPr>
+                <w:color w:val="000000"/>
+              </w:rPr>
+              <w:t xml:space="preserve"> </w:t>
+            </w:r>
+          </w:p>
+          <w:p>
+            <w:pPr>
+              <w:rPr>
+                <w:color w:val="000000"/>
+              </w:rPr>
+            </w:pPr>
+            <w:r>
+              <w:rPr>
+                <w:color w:val="000000"/>
+              </w:rPr>
+              <w:t xml:space="preserve">    // Simula una operación de negocio (capa de negocio)</w:t>
+            </w:r>
+          </w:p>
+          <w:p>
+            <w:pPr>
+              <w:rPr>
+                <w:color w:val="000000"/>
+                <w:lang w:val="en-GB"/>
+              </w:rPr>
+            </w:pPr>
+            <w:r>
+              <w:rPr>
+                <w:color w:val="000000"/>
+              </w:rPr>
+              <w:t xml:space="preserve">    </w:t>
+            </w:r>
+            <w:r>
+              <w:rPr>
+                <w:color w:val="000000"/>
+                <w:lang w:val="en-GB"/>
+              </w:rPr>
+              <w:t>public static void calcular() {</w:t>
+            </w:r>
+          </w:p>
+          <w:p>
+            <w:pPr>
+              <w:rPr>
+                <w:color w:val="000000"/>
+                <w:lang w:val="en-GB"/>
+              </w:rPr>
+            </w:pPr>
+            <w:r>
+              <w:rPr>
+                <w:color w:val="000000"/>
+                <w:lang w:val="en-GB"/>
+              </w:rPr>
+              <w:t xml:space="preserve"> </w:t>
+            </w:r>
+          </w:p>
+          <w:p>
+            <w:pPr>
+              <w:rPr>
+                <w:color w:val="000000"/>
+                <w:lang w:val="en-GB"/>
+              </w:rPr>
+            </w:pPr>
+            <w:r>
+              <w:rPr>
+                <w:color w:val="000000"/>
+                <w:lang w:val="en-GB"/>
+              </w:rPr>
+              <w:t xml:space="preserve">        Scanner sc = new Scanner(System.in);</w:t>
+            </w:r>
+          </w:p>
+          <w:p>
+            <w:pPr>
+              <w:rPr>
+                <w:color w:val="000000"/>
+                <w:lang w:val="en-GB"/>
+              </w:rPr>
+            </w:pPr>
+            <w:r>
+              <w:rPr>
+                <w:color w:val="000000"/>
+                <w:lang w:val="en-GB"/>
+              </w:rPr>
+              <w:t xml:space="preserve"> </w:t>
+            </w:r>
+          </w:p>
+          <w:p>
+            <w:pPr>
+              <w:rPr>
+                <w:color w:val="000000"/>
+              </w:rPr>
+            </w:pPr>
+            <w:r>
+              <w:rPr>
+                <w:color w:val="000000"/>
+                <w:lang w:val="en-GB"/>
+              </w:rPr>
+              <w:t xml:space="preserve">        </w:t>
+            </w:r>
+            <w:r>
+              <w:rPr>
+                <w:color w:val="000000"/>
+              </w:rPr>
+              <w:t>System.out.print("Introduce un número: ");</w:t>
+            </w:r>
+          </w:p>
+          <w:p>
+            <w:pPr>
+              <w:rPr>
+                <w:color w:val="000000"/>
+                <w:lang w:val="en-GB"/>
+              </w:rPr>
+            </w:pPr>
+            <w:r>
+              <w:rPr>
+                <w:color w:val="000000"/>
+              </w:rPr>
+              <w:t xml:space="preserve">        </w:t>
+            </w:r>
+            <w:r>
+              <w:rPr>
+                <w:color w:val="000000"/>
+                <w:lang w:val="en-GB"/>
+              </w:rPr>
+              <w:t>int numero = Integer.parseInt(sc.nextLine());</w:t>
+            </w:r>
+          </w:p>
+          <w:p>
+            <w:pPr>
+              <w:rPr>
+                <w:color w:val="000000"/>
+                <w:lang w:val="en-GB"/>
+              </w:rPr>
+            </w:pPr>
+            <w:r>
+              <w:rPr>
+                <w:color w:val="000000"/>
+                <w:lang w:val="en-GB"/>
+              </w:rPr>
+              <w:t xml:space="preserve"> </w:t>
+            </w:r>
+          </w:p>
+          <w:p>
+            <w:pPr>
+              <w:rPr>
+                <w:color w:val="000000"/>
+              </w:rPr>
+            </w:pPr>
+            <w:r>
+              <w:rPr>
+                <w:color w:val="000000"/>
+                <w:lang w:val="en-GB"/>
+              </w:rPr>
+              <w:t xml:space="preserve">        </w:t>
+            </w:r>
+            <w:r>
+              <w:rPr>
+                <w:color w:val="000000"/>
+              </w:rPr>
+              <w:t>int resultado = 100 / numero;</w:t>
+            </w:r>
+          </w:p>
+          <w:p>
+            <w:pPr>
+              <w:rPr>
+                <w:color w:val="000000"/>
+              </w:rPr>
+            </w:pPr>
+            <w:r>
+              <w:rPr>
+                <w:color w:val="000000"/>
+              </w:rPr>
+              <w:t xml:space="preserve"> </w:t>
+            </w:r>
+          </w:p>
+          <w:p>
+            <w:pPr>
+              <w:rPr>
+                <w:color w:val="000000"/>
+              </w:rPr>
+            </w:pPr>
+            <w:r>
+              <w:rPr>
+                <w:color w:val="000000"/>
+              </w:rPr>
+              <w:t xml:space="preserve">        System.out.println("Resultado: " + resultado);</w:t>
+            </w:r>
+          </w:p>
+          <w:p>
+            <w:pPr>
+              <w:rPr>
+                <w:color w:val="000000"/>
+              </w:rPr>
+            </w:pPr>
+            <w:r>
+              <w:rPr>
+                <w:color w:val="000000"/>
+              </w:rPr>
+              <w:t xml:space="preserve">    }</w:t>
+            </w:r>
+          </w:p>
+          <w:p>
+            <w:pPr>
+              <w:rPr>
+                <w:color w:val="000000"/>
+              </w:rPr>
+            </w:pPr>
+            <w:r>
+              <w:rPr>
+                <w:color w:val="000000"/>
+              </w:rPr>
+              <w:t xml:space="preserve"> </w:t>
+            </w:r>
+          </w:p>
+          <w:p>
+            <w:pPr>
+              <w:rPr>
+                <w:color w:val="000000"/>
+              </w:rPr>
+            </w:pPr>
+            <w:r>
+              <w:rPr>
+                <w:color w:val="000000"/>
+              </w:rPr>
+              <w:t xml:space="preserve">    // Simula el manejador global de Spring</w:t>
+            </w:r>
+          </w:p>
+          <w:p>
+            <w:pPr>
+              <w:rPr>
+                <w:color w:val="000000"/>
+                <w:lang w:val="en-GB"/>
+              </w:rPr>
+            </w:pPr>
+            <w:r>
+              <w:rPr>
+                <w:color w:val="000000"/>
+              </w:rPr>
+              <w:t xml:space="preserve">    </w:t>
+            </w:r>
+            <w:r>
+              <w:rPr>
+                <w:color w:val="000000"/>
+                <w:lang w:val="en-GB"/>
+              </w:rPr>
+              <w:t>public static void manejarExcepcion(RuntimeException e) {</w:t>
+            </w:r>
+          </w:p>
+          <w:p>
+            <w:pPr>
+              <w:rPr>
+                <w:color w:val="000000"/>
+                <w:lang w:val="en-GB"/>
+              </w:rPr>
+            </w:pPr>
+            <w:r>
+              <w:rPr>
+                <w:color w:val="000000"/>
+                <w:lang w:val="en-GB"/>
+              </w:rPr>
+              <w:t xml:space="preserve"> </w:t>
+            </w:r>
+          </w:p>
+          <w:p>
+            <w:pPr>
+              <w:rPr>
+                <w:color w:val="000000"/>
+                <w:lang w:val="en-GB"/>
+              </w:rPr>
+            </w:pPr>
+            <w:r>
+              <w:rPr>
+                <w:color w:val="000000"/>
+                <w:lang w:val="en-GB"/>
+              </w:rPr>
+              <w:t xml:space="preserve">        System.out.println();</w:t>
+            </w:r>
+          </w:p>
+          <w:p>
+            <w:pPr>
+              <w:rPr>
+                <w:color w:val="000000"/>
+                <w:lang w:val="en-GB"/>
+              </w:rPr>
+            </w:pPr>
+            <w:r>
+              <w:rPr>
+                <w:color w:val="000000"/>
+                <w:lang w:val="en-GB"/>
+              </w:rPr>
+              <w:t xml:space="preserve">        System.out.println("===== MANEJADOR GLOBAL =====");</w:t>
+            </w:r>
+          </w:p>
+          <w:p>
+            <w:pPr>
+              <w:rPr>
+                <w:color w:val="000000"/>
+                <w:lang w:val="en-GB"/>
+              </w:rPr>
+            </w:pPr>
+            <w:r>
+              <w:rPr>
+                <w:color w:val="000000"/>
+                <w:lang w:val="en-GB"/>
+              </w:rPr>
+              <w:t xml:space="preserve"> </w:t>
+            </w:r>
+          </w:p>
+          <w:p>
+            <w:pPr>
+              <w:rPr>
+                <w:color w:val="000000"/>
+              </w:rPr>
+            </w:pPr>
+            <w:r>
+              <w:rPr>
+                <w:color w:val="000000"/>
+                <w:lang w:val="en-GB"/>
+              </w:rPr>
+              <w:t xml:space="preserve">        </w:t>
+            </w:r>
+            <w:r>
+              <w:rPr>
+                <w:color w:val="000000"/>
+              </w:rPr>
+              <w:t>if (e instanceof NumberFormatException) {</w:t>
+            </w:r>
+          </w:p>
+          <w:p>
+            <w:pPr>
+              <w:rPr>
+                <w:color w:val="000000"/>
+              </w:rPr>
+            </w:pPr>
+            <w:r>
+              <w:rPr>
+                <w:color w:val="000000"/>
+              </w:rPr>
+              <w:t xml:space="preserve"> </w:t>
+            </w:r>
+          </w:p>
+          <w:p>
+            <w:pPr>
+              <w:rPr>
+                <w:color w:val="000000"/>
+              </w:rPr>
+            </w:pPr>
+            <w:r>
+              <w:rPr>
+                <w:color w:val="000000"/>
+              </w:rPr>
+              <w:t xml:space="preserve">            System.out.println("Error: debes introducir un número.");</w:t>
+            </w:r>
+          </w:p>
+          <w:p>
+            <w:pPr>
+              <w:rPr>
+                <w:color w:val="000000"/>
+              </w:rPr>
+            </w:pPr>
+            <w:r>
+              <w:rPr>
+                <w:color w:val="000000"/>
+              </w:rPr>
+              <w:t xml:space="preserve"> </w:t>
+            </w:r>
+          </w:p>
+          <w:p>
+            <w:pPr>
+              <w:rPr>
+                <w:color w:val="000000"/>
+                <w:lang w:val="en-GB"/>
+              </w:rPr>
+            </w:pPr>
+            <w:r>
+              <w:rPr>
+                <w:color w:val="000000"/>
+              </w:rPr>
+              <w:t xml:space="preserve">        </w:t>
+            </w:r>
+            <w:r>
+              <w:rPr>
+                <w:color w:val="000000"/>
+                <w:lang w:val="en-GB"/>
+              </w:rPr>
+              <w:t>} else if (e instanceof ArithmeticException) {</w:t>
             </w:r>
           </w:p>
           <w:p>
@@ -2778,157 +3164,27 @@
               <w:rPr>
                 <w:color w:val="000000"/>
               </w:rPr>
-              <w:t>manejarExcepcion(e);</w:t>
-            </w:r>
-          </w:p>
-          <w:p>
-            <w:pPr>
-              <w:rPr>
-                <w:color w:val="000000"/>
-              </w:rPr>
-            </w:pPr>
-            <w:r>
-              <w:rPr>
-                <w:color w:val="000000"/>
-              </w:rPr>
-              <w:t xml:space="preserve">        }</w:t>
-            </w:r>
-          </w:p>
-          <w:p>
-            <w:pPr>
-              <w:rPr>
-                <w:color w:val="000000"/>
-              </w:rPr>
-            </w:pPr>
-            <w:r>
-              <w:rPr>
-                <w:color w:val="000000"/>
-              </w:rPr>
-              <w:t xml:space="preserve"> </w:t>
-            </w:r>
-          </w:p>
-          <w:p>
-            <w:pPr>
-              <w:rPr>
-                <w:color w:val="000000"/>
-              </w:rPr>
-            </w:pPr>
-            <w:r>
-              <w:rPr>
-                <w:color w:val="000000"/>
-              </w:rPr>
-              <w:t xml:space="preserve">        System.out.println("Aplicación terminada");</w:t>
-            </w:r>
-          </w:p>
-          <w:p>
-            <w:pPr>
-              <w:rPr>
-                <w:color w:val="000000"/>
-              </w:rPr>
-            </w:pPr>
-            <w:r>
-              <w:rPr>
-                <w:color w:val="000000"/>
-              </w:rPr>
-              <w:t xml:space="preserve">    }</w:t>
-            </w:r>
-          </w:p>
-          <w:p>
-            <w:pPr>
-              <w:rPr>
-                <w:color w:val="000000"/>
-              </w:rPr>
-            </w:pPr>
-            <w:r>
-              <w:rPr>
-                <w:color w:val="000000"/>
-              </w:rPr>
-              <w:t xml:space="preserve"> </w:t>
-            </w:r>
-          </w:p>
-          <w:p>
-            <w:pPr>
-              <w:rPr>
-                <w:color w:val="000000"/>
-              </w:rPr>
-            </w:pPr>
-            <w:r>
-              <w:rPr>
-                <w:color w:val="000000"/>
-              </w:rPr>
-              <w:t xml:space="preserve">    // Simula un controlador (capa del controlador)</w:t>
-            </w:r>
-          </w:p>
-          <w:p>
-            <w:pPr>
-              <w:rPr>
-                <w:color w:val="000000"/>
-              </w:rPr>
-            </w:pPr>
-            <w:r>
-              <w:rPr>
-                <w:color w:val="000000"/>
-              </w:rPr>
-              <w:t xml:space="preserve">    public static void </w:t>
-            </w:r>
-            <w:proofErr w:type="gramStart"/>
-            <w:r>
-              <w:rPr>
-                <w:color w:val="000000"/>
-              </w:rPr>
-              <w:t>controlador(</w:t>
-            </w:r>
-            <w:proofErr w:type="gramEnd"/>
-            <w:r>
-              <w:rPr>
-                <w:color w:val="000000"/>
-              </w:rPr>
-              <w:t>) {</w:t>
-            </w:r>
-          </w:p>
-          <w:p>
-            <w:pPr>
-              <w:rPr>
-                <w:color w:val="000000"/>
-              </w:rPr>
-            </w:pPr>
-            <w:r>
-              <w:rPr>
-                <w:color w:val="000000"/>
-              </w:rPr>
-              <w:t xml:space="preserve"> </w:t>
-            </w:r>
-          </w:p>
-          <w:p>
-            <w:pPr>
-              <w:rPr>
-                <w:color w:val="000000"/>
-              </w:rPr>
-            </w:pPr>
-            <w:r>
-              <w:rPr>
-                <w:color w:val="000000"/>
-              </w:rPr>
-              <w:t xml:space="preserve">        System.out.println("Controlador: recibo la petición");</w:t>
-            </w:r>
-          </w:p>
-          <w:p>
-            <w:pPr>
-              <w:rPr>
-                <w:color w:val="000000"/>
-              </w:rPr>
-            </w:pPr>
-            <w:r>
-              <w:rPr>
-                <w:color w:val="000000"/>
-              </w:rPr>
-              <w:t xml:space="preserve"> </w:t>
-            </w:r>
-          </w:p>
-          <w:p>
-            <w:pPr>
-              <w:rPr>
-                <w:color w:val="000000"/>
+              <w:t>System.out.println("Error: no se puede dividir entre cero.");</w:t>
+            </w:r>
+          </w:p>
+          <w:p>
+            <w:pPr>
+              <w:rPr>
+                <w:color w:val="000000"/>
+              </w:rPr>
+            </w:pPr>
+            <w:r>
+              <w:rPr>
+                <w:color w:val="000000"/>
+              </w:rPr>
+              <w:t xml:space="preserve"> </w:t>
+            </w:r>
+          </w:p>
+          <w:p>
+            <w:pPr>
+              <w:rPr>
+                <w:color w:val="000000"/>
+                <w:lang w:val="en-GB"/>
               </w:rPr>
             </w:pPr>
             <w:r>
@@ -2937,738 +3193,6 @@
               </w:rPr>
               <w:t xml:space="preserve">        </w:t>
             </w:r>
-            <w:proofErr w:type="gramStart"/>
-            <w:r>
-              <w:rPr>
-                <w:color w:val="000000"/>
-              </w:rPr>
-              <w:t>servicio(</w:t>
-            </w:r>
-            <w:proofErr w:type="gramEnd"/>
-            <w:r>
-              <w:rPr>
-                <w:color w:val="000000"/>
-              </w:rPr>
-              <w:t>);</w:t>
-            </w:r>
-          </w:p>
-          <w:p>
-            <w:pPr>
-              <w:rPr>
-                <w:color w:val="000000"/>
-              </w:rPr>
-            </w:pPr>
-            <w:r>
-              <w:rPr>
-                <w:color w:val="000000"/>
-              </w:rPr>
-              <w:t xml:space="preserve"> </w:t>
-            </w:r>
-          </w:p>
-          <w:p>
-            <w:pPr>
-              <w:rPr>
-                <w:color w:val="000000"/>
-              </w:rPr>
-            </w:pPr>
-            <w:r>
-              <w:rPr>
-                <w:color w:val="000000"/>
-              </w:rPr>
-              <w:t xml:space="preserve">        System.out.println("Controlador: petición procesada");</w:t>
-            </w:r>
-          </w:p>
-          <w:p>
-            <w:pPr>
-              <w:rPr>
-                <w:color w:val="000000"/>
-              </w:rPr>
-            </w:pPr>
-            <w:r>
-              <w:rPr>
-                <w:color w:val="000000"/>
-              </w:rPr>
-              <w:t xml:space="preserve">    }</w:t>
-            </w:r>
-          </w:p>
-          <w:p>
-            <w:pPr>
-              <w:rPr>
-                <w:color w:val="000000"/>
-              </w:rPr>
-            </w:pPr>
-            <w:r>
-              <w:rPr>
-                <w:color w:val="000000"/>
-              </w:rPr>
-              <w:t xml:space="preserve"> </w:t>
-            </w:r>
-          </w:p>
-          <w:p>
-            <w:pPr>
-              <w:rPr>
-                <w:color w:val="000000"/>
-              </w:rPr>
-            </w:pPr>
-            <w:r>
-              <w:rPr>
-                <w:color w:val="000000"/>
-              </w:rPr>
-              <w:t xml:space="preserve">    // Simula la capa de servicio</w:t>
-            </w:r>
-          </w:p>
-          <w:p>
-            <w:pPr>
-              <w:rPr>
-                <w:color w:val="000000"/>
-              </w:rPr>
-            </w:pPr>
-            <w:r>
-              <w:rPr>
-                <w:color w:val="000000"/>
-              </w:rPr>
-              <w:t xml:space="preserve">    public static void </w:t>
-            </w:r>
-            <w:proofErr w:type="gramStart"/>
-            <w:r>
-              <w:rPr>
-                <w:color w:val="000000"/>
-              </w:rPr>
-              <w:t>servicio(</w:t>
-            </w:r>
-            <w:proofErr w:type="gramEnd"/>
-            <w:r>
-              <w:rPr>
-                <w:color w:val="000000"/>
-              </w:rPr>
-              <w:t>) {</w:t>
-            </w:r>
-          </w:p>
-          <w:p>
-            <w:pPr>
-              <w:rPr>
-                <w:color w:val="000000"/>
-              </w:rPr>
-            </w:pPr>
-            <w:r>
-              <w:rPr>
-                <w:color w:val="000000"/>
-              </w:rPr>
-              <w:t xml:space="preserve"> </w:t>
-            </w:r>
-          </w:p>
-          <w:p>
-            <w:pPr>
-              <w:rPr>
-                <w:color w:val="000000"/>
-              </w:rPr>
-            </w:pPr>
-            <w:r>
-              <w:rPr>
-                <w:color w:val="000000"/>
-              </w:rPr>
-              <w:t xml:space="preserve">        System.out.println("Servicio: voy a realizar el cálculo");</w:t>
-            </w:r>
-          </w:p>
-          <w:p>
-            <w:pPr>
-              <w:rPr>
-                <w:color w:val="000000"/>
-              </w:rPr>
-            </w:pPr>
-            <w:r>
-              <w:rPr>
-                <w:color w:val="000000"/>
-              </w:rPr>
-              <w:t xml:space="preserve"> </w:t>
-            </w:r>
-          </w:p>
-          <w:p>
-            <w:pPr>
-              <w:rPr>
-                <w:color w:val="000000"/>
-              </w:rPr>
-            </w:pPr>
-            <w:r>
-              <w:rPr>
-                <w:color w:val="000000"/>
-              </w:rPr>
-              <w:t xml:space="preserve">        </w:t>
-            </w:r>
-            <w:proofErr w:type="gramStart"/>
-            <w:r>
-              <w:rPr>
-                <w:color w:val="000000"/>
-              </w:rPr>
-              <w:t>calcular(</w:t>
-            </w:r>
-            <w:proofErr w:type="gramEnd"/>
-            <w:r>
-              <w:rPr>
-                <w:color w:val="000000"/>
-              </w:rPr>
-              <w:t>);</w:t>
-            </w:r>
-          </w:p>
-          <w:p>
-            <w:pPr>
-              <w:rPr>
-                <w:color w:val="000000"/>
-              </w:rPr>
-            </w:pPr>
-            <w:r>
-              <w:rPr>
-                <w:color w:val="000000"/>
-              </w:rPr>
-              <w:t xml:space="preserve"> </w:t>
-            </w:r>
-          </w:p>
-          <w:p>
-            <w:pPr>
-              <w:rPr>
-                <w:color w:val="000000"/>
-              </w:rPr>
-            </w:pPr>
-            <w:r>
-              <w:rPr>
-                <w:color w:val="000000"/>
-              </w:rPr>
-              <w:t xml:space="preserve">        System.out.println("Servicio: cálculo terminado");</w:t>
-            </w:r>
-          </w:p>
-          <w:p>
-            <w:pPr>
-              <w:rPr>
-                <w:color w:val="000000"/>
-              </w:rPr>
-            </w:pPr>
-            <w:r>
-              <w:rPr>
-                <w:color w:val="000000"/>
-              </w:rPr>
-              <w:t xml:space="preserve">    }</w:t>
-            </w:r>
-          </w:p>
-          <w:p>
-            <w:pPr>
-              <w:rPr>
-                <w:color w:val="000000"/>
-              </w:rPr>
-            </w:pPr>
-            <w:r>
-              <w:rPr>
-                <w:color w:val="000000"/>
-              </w:rPr>
-              <w:t xml:space="preserve"> </w:t>
-            </w:r>
-          </w:p>
-          <w:p>
-            <w:pPr>
-              <w:rPr>
-                <w:color w:val="000000"/>
-              </w:rPr>
-            </w:pPr>
-            <w:r>
-              <w:rPr>
-                <w:color w:val="000000"/>
-              </w:rPr>
-              <w:lastRenderedPageBreak/>
-              <w:t xml:space="preserve">    // Simula una operación de negocio (capa de negocio)</w:t>
-            </w:r>
-          </w:p>
-          <w:p>
-            <w:pPr>
-              <w:rPr>
-                <w:color w:val="000000"/>
-                <w:lang w:val="en-GB"/>
-              </w:rPr>
-            </w:pPr>
-            <w:r>
-              <w:rPr>
-                <w:color w:val="000000"/>
-              </w:rPr>
-              <w:t xml:space="preserve">    </w:t>
-            </w:r>
-            <w:r>
-              <w:rPr>
-                <w:color w:val="000000"/>
-                <w:lang w:val="en-GB"/>
-              </w:rPr>
-              <w:t xml:space="preserve">public static void </w:t>
-            </w:r>
-            <w:proofErr w:type="gramStart"/>
-            <w:r>
-              <w:rPr>
-                <w:color w:val="000000"/>
-                <w:lang w:val="en-GB"/>
-              </w:rPr>
-              <w:t>calcular(</w:t>
-            </w:r>
-            <w:proofErr w:type="gramEnd"/>
-            <w:r>
-              <w:rPr>
-                <w:color w:val="000000"/>
-                <w:lang w:val="en-GB"/>
-              </w:rPr>
-              <w:t>) {</w:t>
-            </w:r>
-          </w:p>
-          <w:p>
-            <w:pPr>
-              <w:rPr>
-                <w:color w:val="000000"/>
-                <w:lang w:val="en-GB"/>
-              </w:rPr>
-            </w:pPr>
-            <w:r>
-              <w:rPr>
-                <w:color w:val="000000"/>
-                <w:lang w:val="en-GB"/>
-              </w:rPr>
-              <w:t xml:space="preserve"> </w:t>
-            </w:r>
-          </w:p>
-          <w:p>
-            <w:pPr>
-              <w:rPr>
-                <w:color w:val="000000"/>
-                <w:lang w:val="en-GB"/>
-              </w:rPr>
-            </w:pPr>
-            <w:r>
-              <w:rPr>
-                <w:color w:val="000000"/>
-                <w:lang w:val="en-GB"/>
-              </w:rPr>
-              <w:t xml:space="preserve">        Scanner sc = new </w:t>
-            </w:r>
-            <w:proofErr w:type="gramStart"/>
-            <w:r>
-              <w:rPr>
-                <w:color w:val="000000"/>
-                <w:lang w:val="en-GB"/>
-              </w:rPr>
-              <w:t>Scanner(</w:t>
-            </w:r>
-            <w:proofErr w:type="gramEnd"/>
-            <w:r>
-              <w:rPr>
-                <w:color w:val="000000"/>
-                <w:lang w:val="en-GB"/>
-              </w:rPr>
-              <w:t>System.in);</w:t>
-            </w:r>
-          </w:p>
-          <w:p>
-            <w:pPr>
-              <w:rPr>
-                <w:color w:val="000000"/>
-                <w:lang w:val="en-GB"/>
-              </w:rPr>
-            </w:pPr>
-            <w:r>
-              <w:rPr>
-                <w:color w:val="000000"/>
-                <w:lang w:val="en-GB"/>
-              </w:rPr>
-              <w:t xml:space="preserve"> </w:t>
-            </w:r>
-          </w:p>
-          <w:p>
-            <w:pPr>
-              <w:rPr>
-                <w:color w:val="000000"/>
-              </w:rPr>
-            </w:pPr>
-            <w:r>
-              <w:rPr>
-                <w:color w:val="000000"/>
-                <w:lang w:val="en-GB"/>
-              </w:rPr>
-              <w:t xml:space="preserve">        </w:t>
-            </w:r>
-            <w:r>
-              <w:rPr>
-                <w:color w:val="000000"/>
-              </w:rPr>
-              <w:t>System.out.print("Introduce un número: ");</w:t>
-            </w:r>
-          </w:p>
-          <w:p>
-            <w:pPr>
-              <w:rPr>
-                <w:color w:val="000000"/>
-                <w:lang w:val="en-GB"/>
-              </w:rPr>
-            </w:pPr>
-            <w:r>
-              <w:rPr>
-                <w:color w:val="000000"/>
-              </w:rPr>
-              <w:t xml:space="preserve">        </w:t>
-            </w:r>
-            <w:r>
-              <w:rPr>
-                <w:color w:val="000000"/>
-                <w:lang w:val="en-GB"/>
-              </w:rPr>
-              <w:t>int numero = Integer.parseInt(</w:t>
-            </w:r>
-            <w:proofErr w:type="gramStart"/>
-            <w:r>
-              <w:rPr>
-                <w:color w:val="000000"/>
-                <w:lang w:val="en-GB"/>
-              </w:rPr>
-              <w:t>sc.nextLine</w:t>
-            </w:r>
-            <w:proofErr w:type="gramEnd"/>
-            <w:r>
-              <w:rPr>
-                <w:color w:val="000000"/>
-                <w:lang w:val="en-GB"/>
-              </w:rPr>
-              <w:t>());</w:t>
-            </w:r>
-          </w:p>
-          <w:p>
-            <w:pPr>
-              <w:rPr>
-                <w:color w:val="000000"/>
-                <w:lang w:val="en-GB"/>
-              </w:rPr>
-            </w:pPr>
-            <w:r>
-              <w:rPr>
-                <w:color w:val="000000"/>
-                <w:lang w:val="en-GB"/>
-              </w:rPr>
-              <w:t xml:space="preserve"> </w:t>
-            </w:r>
-          </w:p>
-          <w:p>
-            <w:pPr>
-              <w:rPr>
-                <w:color w:val="000000"/>
-              </w:rPr>
-            </w:pPr>
-            <w:r>
-              <w:rPr>
-                <w:color w:val="000000"/>
-                <w:lang w:val="en-GB"/>
-              </w:rPr>
-              <w:t xml:space="preserve">        </w:t>
-            </w:r>
-            <w:r>
-              <w:rPr>
-                <w:color w:val="000000"/>
-              </w:rPr>
-              <w:t>int resultado = 100 / numero;</w:t>
-            </w:r>
-          </w:p>
-          <w:p>
-            <w:pPr>
-              <w:rPr>
-                <w:color w:val="000000"/>
-              </w:rPr>
-            </w:pPr>
-            <w:r>
-              <w:rPr>
-                <w:color w:val="000000"/>
-              </w:rPr>
-              <w:t xml:space="preserve"> </w:t>
-            </w:r>
-          </w:p>
-          <w:p>
-            <w:pPr>
-              <w:rPr>
-                <w:color w:val="000000"/>
-              </w:rPr>
-            </w:pPr>
-            <w:r>
-              <w:rPr>
-                <w:color w:val="000000"/>
-              </w:rPr>
-              <w:t xml:space="preserve">        System.out.println("Resultado: " + resultado);</w:t>
-            </w:r>
-          </w:p>
-          <w:p>
-            <w:pPr>
-              <w:rPr>
-                <w:color w:val="000000"/>
-              </w:rPr>
-            </w:pPr>
-            <w:r>
-              <w:rPr>
-                <w:color w:val="000000"/>
-              </w:rPr>
-              <w:t xml:space="preserve">    }</w:t>
-            </w:r>
-          </w:p>
-          <w:p>
-            <w:pPr>
-              <w:rPr>
-                <w:color w:val="000000"/>
-              </w:rPr>
-            </w:pPr>
-            <w:r>
-              <w:rPr>
-                <w:color w:val="000000"/>
-              </w:rPr>
-              <w:t xml:space="preserve"> </w:t>
-            </w:r>
-          </w:p>
-          <w:p>
-            <w:pPr>
-              <w:rPr>
-                <w:color w:val="000000"/>
-              </w:rPr>
-            </w:pPr>
-            <w:r>
-              <w:rPr>
-                <w:color w:val="000000"/>
-              </w:rPr>
-              <w:t xml:space="preserve">    // Simula el manejador global de Spring</w:t>
-            </w:r>
-          </w:p>
-          <w:p>
-            <w:pPr>
-              <w:rPr>
-                <w:color w:val="000000"/>
-                <w:lang w:val="en-GB"/>
-              </w:rPr>
-            </w:pPr>
-            <w:r>
-              <w:rPr>
-                <w:color w:val="000000"/>
-              </w:rPr>
-              <w:t xml:space="preserve">    </w:t>
-            </w:r>
-            <w:r>
-              <w:rPr>
-                <w:color w:val="000000"/>
-                <w:lang w:val="en-GB"/>
-              </w:rPr>
-              <w:t xml:space="preserve">public static void </w:t>
-            </w:r>
-            <w:proofErr w:type="gramStart"/>
-            <w:r>
-              <w:rPr>
-                <w:color w:val="000000"/>
-                <w:lang w:val="en-GB"/>
-              </w:rPr>
-              <w:t>manejarExcepcion(</w:t>
-            </w:r>
-            <w:proofErr w:type="gramEnd"/>
-            <w:r>
-              <w:rPr>
-                <w:color w:val="000000"/>
-                <w:lang w:val="en-GB"/>
-              </w:rPr>
-              <w:t>RuntimeException e) {</w:t>
-            </w:r>
-          </w:p>
-          <w:p>
-            <w:pPr>
-              <w:rPr>
-                <w:color w:val="000000"/>
-                <w:lang w:val="en-GB"/>
-              </w:rPr>
-            </w:pPr>
-            <w:r>
-              <w:rPr>
-                <w:color w:val="000000"/>
-                <w:lang w:val="en-GB"/>
-              </w:rPr>
-              <w:t xml:space="preserve"> </w:t>
-            </w:r>
-          </w:p>
-          <w:p>
-            <w:pPr>
-              <w:rPr>
-                <w:color w:val="000000"/>
-                <w:lang w:val="en-GB"/>
-              </w:rPr>
-            </w:pPr>
-            <w:r>
-              <w:rPr>
-                <w:color w:val="000000"/>
-                <w:lang w:val="en-GB"/>
-              </w:rPr>
-              <w:t xml:space="preserve">        System.out.println();</w:t>
-            </w:r>
-          </w:p>
-          <w:p>
-            <w:pPr>
-              <w:rPr>
-                <w:color w:val="000000"/>
-                <w:lang w:val="en-GB"/>
-              </w:rPr>
-            </w:pPr>
-            <w:r>
-              <w:rPr>
-                <w:color w:val="000000"/>
-                <w:lang w:val="en-GB"/>
-              </w:rPr>
-              <w:t xml:space="preserve">        System.out.println("===== MANEJADOR GLOBAL =====");</w:t>
-            </w:r>
-          </w:p>
-          <w:p>
-            <w:pPr>
-              <w:rPr>
-                <w:color w:val="000000"/>
-                <w:lang w:val="en-GB"/>
-              </w:rPr>
-            </w:pPr>
-            <w:r>
-              <w:rPr>
-                <w:color w:val="000000"/>
-                <w:lang w:val="en-GB"/>
-              </w:rPr>
-              <w:t xml:space="preserve"> </w:t>
-            </w:r>
-          </w:p>
-          <w:p>
-            <w:pPr>
-              <w:rPr>
-                <w:color w:val="000000"/>
-              </w:rPr>
-            </w:pPr>
-            <w:r>
-              <w:rPr>
-                <w:color w:val="000000"/>
-                <w:lang w:val="en-GB"/>
-              </w:rPr>
-              <w:t xml:space="preserve">        </w:t>
-            </w:r>
-            <w:r>
-              <w:rPr>
-                <w:color w:val="000000"/>
-              </w:rPr>
-              <w:t>if (e instanceof NumberFormatException) {</w:t>
-            </w:r>
-          </w:p>
-          <w:p>
-            <w:pPr>
-              <w:rPr>
-                <w:color w:val="000000"/>
-              </w:rPr>
-            </w:pPr>
-            <w:r>
-              <w:rPr>
-                <w:color w:val="000000"/>
-              </w:rPr>
-              <w:t xml:space="preserve"> </w:t>
-            </w:r>
-          </w:p>
-          <w:p>
-            <w:pPr>
-              <w:rPr>
-                <w:color w:val="000000"/>
-              </w:rPr>
-            </w:pPr>
-            <w:r>
-              <w:rPr>
-                <w:color w:val="000000"/>
-              </w:rPr>
-              <w:t xml:space="preserve">            System.out.println("Error: debes introducir un número.");</w:t>
-            </w:r>
-          </w:p>
-          <w:p>
-            <w:pPr>
-              <w:rPr>
-                <w:color w:val="000000"/>
-              </w:rPr>
-            </w:pPr>
-            <w:r>
-              <w:rPr>
-                <w:color w:val="000000"/>
-              </w:rPr>
-              <w:t xml:space="preserve"> </w:t>
-            </w:r>
-          </w:p>
-          <w:p>
-            <w:pPr>
-              <w:rPr>
-                <w:color w:val="000000"/>
-                <w:lang w:val="en-GB"/>
-              </w:rPr>
-            </w:pPr>
-            <w:r>
-              <w:rPr>
-                <w:color w:val="000000"/>
-              </w:rPr>
-              <w:t xml:space="preserve">        </w:t>
-            </w:r>
-            <w:r>
-              <w:rPr>
-                <w:color w:val="000000"/>
-                <w:lang w:val="en-GB"/>
-              </w:rPr>
-              <w:t>} else if (e instanceof ArithmeticException) {</w:t>
-            </w:r>
-          </w:p>
-          <w:p>
-            <w:pPr>
-              <w:rPr>
-                <w:color w:val="000000"/>
-                <w:lang w:val="en-GB"/>
-              </w:rPr>
-            </w:pPr>
-            <w:r>
-              <w:rPr>
-                <w:color w:val="000000"/>
-                <w:lang w:val="en-GB"/>
-              </w:rPr>
-              <w:t xml:space="preserve"> </w:t>
-            </w:r>
-          </w:p>
-          <w:p>
-            <w:pPr>
-              <w:rPr>
-                <w:color w:val="000000"/>
-              </w:rPr>
-            </w:pPr>
-            <w:r>
-              <w:rPr>
-                <w:color w:val="000000"/>
-                <w:lang w:val="en-GB"/>
-              </w:rPr>
-              <w:t xml:space="preserve">            </w:t>
-            </w:r>
-            <w:r>
-              <w:rPr>
-                <w:color w:val="000000"/>
-              </w:rPr>
-              <w:t>System.out.println("Error: no se puede dividir entre cero.");</w:t>
-            </w:r>
-          </w:p>
-          <w:p>
-            <w:pPr>
-              <w:rPr>
-                <w:color w:val="000000"/>
-              </w:rPr>
-            </w:pPr>
-            <w:r>
-              <w:rPr>
-                <w:color w:val="000000"/>
-              </w:rPr>
-              <w:t xml:space="preserve"> </w:t>
-            </w:r>
-          </w:p>
-          <w:p>
-            <w:pPr>
-              <w:rPr>
-                <w:color w:val="000000"/>
-                <w:lang w:val="en-GB"/>
-              </w:rPr>
-            </w:pPr>
-            <w:r>
-              <w:rPr>
-                <w:color w:val="000000"/>
-              </w:rPr>
-              <w:t xml:space="preserve">        </w:t>
-            </w:r>
             <w:r>
               <w:rPr>
                 <w:color w:val="000000"/>
@@ -3704,23 +3228,7 @@
                 <w:color w:val="000000"/>
                 <w:lang w:val="en-GB"/>
               </w:rPr>
-              <w:t xml:space="preserve">            System.out.println("Error inesperado: " + </w:t>
-            </w:r>
-            <w:proofErr w:type="gramStart"/>
-            <w:r>
-              <w:rPr>
-                <w:color w:val="000000"/>
-                <w:lang w:val="en-GB"/>
-              </w:rPr>
-              <w:t>e.getMessage</w:t>
-            </w:r>
-            <w:proofErr w:type="gramEnd"/>
-            <w:r>
-              <w:rPr>
-                <w:color w:val="000000"/>
-                <w:lang w:val="en-GB"/>
-              </w:rPr>
-              <w:t>());</w:t>
+              <w:t xml:space="preserve">            System.out.println("Error inesperado: " + e.getMessage());</w:t>
             </w:r>
           </w:p>
           <w:p>
@@ -3880,6 +3388,7 @@
         <w:ind w:left="720"/>
       </w:pPr>
       <w:r>
+        <w:lastRenderedPageBreak/>
         <w:t>Aplicación terminada</w:t>
       </w:r>
     </w:p>
@@ -3900,19 +3409,11 @@
           <w:color w:val="000000"/>
         </w:rPr>
       </w:pPr>
-      <w:proofErr w:type="gramStart"/>
       <w:r>
         <w:rPr>
           <w:color w:val="000000"/>
         </w:rPr>
-        <w:t>¿Por qué no se ejecuta: System.out.</w:t>
-      </w:r>
-      <w:proofErr w:type="gramEnd"/>
-      <w:r>
-        <w:rPr>
-          <w:color w:val="000000"/>
-        </w:rPr>
-        <w:t>println("Servicio: cálculo terminado")?</w:t>
+        <w:t>¿Por qué no se ejecuta: System.out.println("Servicio: cálculo terminado")?</w:t>
       </w:r>
     </w:p>
     <w:p>
@@ -3927,8 +3428,25 @@
         <w:ind w:left="720"/>
       </w:pPr>
       <w:r>
-        <w:lastRenderedPageBreak/>
-        <w:t xml:space="preserve">porque cuando hay una RuntimeException el try catch para la ejecucion del codigo dentro del try asi que nunca llega a ejecutar esa parte </w:t>
+        <w:t xml:space="preserve">porque cuando hay una RuntimeException el try catch para la </w:t>
+      </w:r>
+      <w:r>
+        <w:t>ejecución</w:t>
+      </w:r>
+      <w:r>
+        <w:t xml:space="preserve"> del </w:t>
+      </w:r>
+      <w:r>
+        <w:t>código</w:t>
+      </w:r>
+      <w:r>
+        <w:t xml:space="preserve"> dentro del try </w:t>
+      </w:r>
+      <w:r>
+        <w:t>así</w:t>
+      </w:r>
+      <w:r>
+        <w:t xml:space="preserve"> que nunca llega a ejecutar esa parte </w:t>
       </w:r>
     </w:p>
     <w:p>
@@ -4142,29 +3660,7 @@
                 <w:szCs w:val="20"/>
                 <w:lang w:val="en-GB"/>
               </w:rPr>
-              <w:t xml:space="preserve"> </w:t>
-            </w:r>
-            <w:proofErr w:type="gramStart"/>
-            <w:r>
-              <w:rPr>
-                <w:rFonts w:ascii="Consolas" w:eastAsia="Consolas" w:hAnsi="Consolas" w:cs="Consolas"/>
-                <w:color w:val="000000"/>
-                <w:sz w:val="20"/>
-                <w:szCs w:val="20"/>
-                <w:lang w:val="en-GB"/>
-              </w:rPr>
-              <w:t>main(String[</w:t>
-            </w:r>
-            <w:proofErr w:type="gramEnd"/>
-            <w:r>
-              <w:rPr>
-                <w:rFonts w:ascii="Consolas" w:eastAsia="Consolas" w:hAnsi="Consolas" w:cs="Consolas"/>
-                <w:color w:val="000000"/>
-                <w:sz w:val="20"/>
-                <w:szCs w:val="20"/>
-                <w:lang w:val="en-GB"/>
-              </w:rPr>
-              <w:t xml:space="preserve">] </w:t>
+              <w:t xml:space="preserve"> main(String[] </w:t>
             </w:r>
             <w:r>
               <w:rPr>
@@ -4264,19 +3760,8 @@
                 <w:sz w:val="20"/>
                 <w:szCs w:val="20"/>
               </w:rPr>
-              <w:t xml:space="preserve"> </w:t>
-            </w:r>
-            <w:proofErr w:type="gramStart"/>
-            <w:r>
-              <w:rPr>
-                <w:rFonts w:ascii="Consolas" w:eastAsia="Consolas" w:hAnsi="Consolas" w:cs="Consolas"/>
-                <w:color w:val="000000"/>
-                <w:sz w:val="20"/>
-                <w:szCs w:val="20"/>
-              </w:rPr>
-              <w:t>Cuenta(</w:t>
-            </w:r>
-            <w:proofErr w:type="gramEnd"/>
+              <w:t xml:space="preserve"> Cuenta(</w:t>
+            </w:r>
             <w:r>
               <w:rPr>
                 <w:rFonts w:ascii="Consolas" w:eastAsia="Consolas" w:hAnsi="Consolas" w:cs="Consolas"/>
@@ -4345,19 +3830,8 @@
                 <w:sz w:val="20"/>
                 <w:szCs w:val="20"/>
               </w:rPr>
-              <w:t xml:space="preserve"> </w:t>
-            </w:r>
-            <w:proofErr w:type="gramStart"/>
-            <w:r>
-              <w:rPr>
-                <w:rFonts w:ascii="Consolas" w:eastAsia="Consolas" w:hAnsi="Consolas" w:cs="Consolas"/>
-                <w:color w:val="000000"/>
-                <w:sz w:val="20"/>
-                <w:szCs w:val="20"/>
-              </w:rPr>
-              <w:t>Cuenta(</w:t>
-            </w:r>
-            <w:proofErr w:type="gramEnd"/>
+              <w:t xml:space="preserve"> Cuenta(</w:t>
+            </w:r>
             <w:r>
               <w:rPr>
                 <w:rFonts w:ascii="Consolas" w:eastAsia="Consolas" w:hAnsi="Consolas" w:cs="Consolas"/>
@@ -4440,57 +3914,36 @@
                 <w:sz w:val="20"/>
                 <w:szCs w:val="20"/>
               </w:rPr>
-              <w:t xml:space="preserve"> </w:t>
-            </w:r>
-            <w:proofErr w:type="gramStart"/>
-            <w:r>
-              <w:rPr>
-                <w:rFonts w:ascii="Consolas" w:eastAsia="Consolas" w:hAnsi="Consolas" w:cs="Consolas"/>
-                <w:color w:val="000000"/>
-                <w:sz w:val="20"/>
-                <w:szCs w:val="20"/>
-              </w:rPr>
-              <w:t>Banco(</w:t>
-            </w:r>
-            <w:proofErr w:type="gramEnd"/>
-            <w:r>
-              <w:rPr>
-                <w:rFonts w:ascii="Consolas" w:eastAsia="Consolas" w:hAnsi="Consolas" w:cs="Consolas"/>
-                <w:color w:val="000000"/>
-                <w:sz w:val="20"/>
-                <w:szCs w:val="20"/>
-              </w:rPr>
-              <w:t xml:space="preserve">); </w:t>
-            </w:r>
-          </w:p>
-          <w:p>
-            <w:pPr>
-              <w:shd w:val="clear" w:color="auto" w:fill="FFFFFF"/>
-            </w:pPr>
-            <w:r>
-              <w:rPr>
-                <w:rFonts w:ascii="Consolas" w:eastAsia="Consolas" w:hAnsi="Consolas" w:cs="Consolas"/>
-                <w:color w:val="000000"/>
-                <w:sz w:val="20"/>
-                <w:szCs w:val="20"/>
-              </w:rPr>
-              <w:t xml:space="preserve"> </w:t>
-            </w:r>
-          </w:p>
-          <w:p>
-            <w:pPr>
-              <w:shd w:val="clear" w:color="auto" w:fill="FFFFFF"/>
-            </w:pPr>
-            <w:r>
-              <w:rPr>
-                <w:rFonts w:ascii="Consolas" w:eastAsia="Consolas" w:hAnsi="Consolas" w:cs="Consolas"/>
-                <w:color w:val="000000"/>
-                <w:sz w:val="20"/>
-                <w:szCs w:val="20"/>
-              </w:rPr>
-              <w:t xml:space="preserve"> </w:t>
-            </w:r>
-            <w:proofErr w:type="gramStart"/>
+              <w:t xml:space="preserve"> Banco(); </w:t>
+            </w:r>
+          </w:p>
+          <w:p>
+            <w:pPr>
+              <w:shd w:val="clear" w:color="auto" w:fill="FFFFFF"/>
+            </w:pPr>
+            <w:r>
+              <w:rPr>
+                <w:rFonts w:ascii="Consolas" w:eastAsia="Consolas" w:hAnsi="Consolas" w:cs="Consolas"/>
+                <w:color w:val="000000"/>
+                <w:sz w:val="20"/>
+                <w:szCs w:val="20"/>
+              </w:rPr>
+              <w:t xml:space="preserve"> </w:t>
+            </w:r>
+          </w:p>
+          <w:p>
+            <w:pPr>
+              <w:shd w:val="clear" w:color="auto" w:fill="FFFFFF"/>
+            </w:pPr>
+            <w:r>
+              <w:rPr>
+                <w:rFonts w:ascii="Consolas" w:eastAsia="Consolas" w:hAnsi="Consolas" w:cs="Consolas"/>
+                <w:color w:val="000000"/>
+                <w:sz w:val="20"/>
+                <w:szCs w:val="20"/>
+              </w:rPr>
+              <w:t xml:space="preserve"> </w:t>
+            </w:r>
             <w:r>
               <w:rPr>
                 <w:rFonts w:ascii="Consolas" w:eastAsia="Consolas" w:hAnsi="Consolas" w:cs="Consolas"/>
@@ -4509,18 +3962,7 @@
                 <w:szCs w:val="20"/>
                 <w:u w:val="single"/>
               </w:rPr>
-              <w:t>.transferir</w:t>
-            </w:r>
-            <w:proofErr w:type="gramEnd"/>
-            <w:r>
-              <w:rPr>
-                <w:rFonts w:ascii="Consolas" w:eastAsia="Consolas" w:hAnsi="Consolas" w:cs="Consolas"/>
-                <w:color w:val="000000"/>
-                <w:sz w:val="20"/>
-                <w:szCs w:val="20"/>
-                <w:u w:val="single"/>
-              </w:rPr>
-              <w:t>(</w:t>
+              <w:t>.transferir(</w:t>
             </w:r>
             <w:r>
               <w:rPr>
@@ -4835,57 +4277,36 @@
                 <w:sz w:val="20"/>
                 <w:szCs w:val="20"/>
               </w:rPr>
-              <w:t xml:space="preserve"> </w:t>
-            </w:r>
-            <w:proofErr w:type="gramStart"/>
-            <w:r>
-              <w:rPr>
-                <w:rFonts w:ascii="Consolas" w:eastAsia="Consolas" w:hAnsi="Consolas" w:cs="Consolas"/>
-                <w:color w:val="000000"/>
-                <w:sz w:val="20"/>
-                <w:szCs w:val="20"/>
-              </w:rPr>
-              <w:t>GestorFicheros(</w:t>
-            </w:r>
-            <w:proofErr w:type="gramEnd"/>
-            <w:r>
-              <w:rPr>
-                <w:rFonts w:ascii="Consolas" w:eastAsia="Consolas" w:hAnsi="Consolas" w:cs="Consolas"/>
-                <w:color w:val="000000"/>
-                <w:sz w:val="20"/>
-                <w:szCs w:val="20"/>
-              </w:rPr>
-              <w:t xml:space="preserve">); </w:t>
-            </w:r>
-          </w:p>
-          <w:p>
-            <w:pPr>
-              <w:shd w:val="clear" w:color="auto" w:fill="FFFFFF"/>
-            </w:pPr>
-            <w:r>
-              <w:rPr>
-                <w:rFonts w:ascii="Consolas" w:eastAsia="Consolas" w:hAnsi="Consolas" w:cs="Consolas"/>
-                <w:color w:val="000000"/>
-                <w:sz w:val="20"/>
-                <w:szCs w:val="20"/>
-              </w:rPr>
-              <w:t xml:space="preserve"> </w:t>
-            </w:r>
-          </w:p>
-          <w:p>
-            <w:pPr>
-              <w:shd w:val="clear" w:color="auto" w:fill="FFFFFF"/>
-            </w:pPr>
-            <w:r>
-              <w:rPr>
-                <w:rFonts w:ascii="Consolas" w:eastAsia="Consolas" w:hAnsi="Consolas" w:cs="Consolas"/>
-                <w:color w:val="000000"/>
-                <w:sz w:val="20"/>
-                <w:szCs w:val="20"/>
-              </w:rPr>
-              <w:t xml:space="preserve"> </w:t>
-            </w:r>
-            <w:proofErr w:type="gramStart"/>
+              <w:t xml:space="preserve"> GestorFicheros(); </w:t>
+            </w:r>
+          </w:p>
+          <w:p>
+            <w:pPr>
+              <w:shd w:val="clear" w:color="auto" w:fill="FFFFFF"/>
+            </w:pPr>
+            <w:r>
+              <w:rPr>
+                <w:rFonts w:ascii="Consolas" w:eastAsia="Consolas" w:hAnsi="Consolas" w:cs="Consolas"/>
+                <w:color w:val="000000"/>
+                <w:sz w:val="20"/>
+                <w:szCs w:val="20"/>
+              </w:rPr>
+              <w:t xml:space="preserve"> </w:t>
+            </w:r>
+          </w:p>
+          <w:p>
+            <w:pPr>
+              <w:shd w:val="clear" w:color="auto" w:fill="FFFFFF"/>
+            </w:pPr>
+            <w:r>
+              <w:rPr>
+                <w:rFonts w:ascii="Consolas" w:eastAsia="Consolas" w:hAnsi="Consolas" w:cs="Consolas"/>
+                <w:color w:val="000000"/>
+                <w:sz w:val="20"/>
+                <w:szCs w:val="20"/>
+              </w:rPr>
+              <w:t xml:space="preserve"> </w:t>
+            </w:r>
             <w:r>
               <w:rPr>
                 <w:rFonts w:ascii="Consolas" w:eastAsia="Consolas" w:hAnsi="Consolas" w:cs="Consolas"/>
@@ -4902,17 +4323,7 @@
                 <w:sz w:val="20"/>
                 <w:szCs w:val="20"/>
               </w:rPr>
-              <w:t>.comprobarFichero</w:t>
-            </w:r>
-            <w:proofErr w:type="gramEnd"/>
-            <w:r>
-              <w:rPr>
-                <w:rFonts w:ascii="Consolas" w:eastAsia="Consolas" w:hAnsi="Consolas" w:cs="Consolas"/>
-                <w:color w:val="000000"/>
-                <w:sz w:val="20"/>
-                <w:szCs w:val="20"/>
-              </w:rPr>
-              <w:t xml:space="preserve">(); </w:t>
+              <w:t xml:space="preserve">.comprobarFichero(); </w:t>
             </w:r>
           </w:p>
           <w:p>
@@ -5273,29 +4684,7 @@
                 <w:szCs w:val="20"/>
                 <w:lang w:val="en-GB"/>
               </w:rPr>
-              <w:t xml:space="preserve"> </w:t>
-            </w:r>
-            <w:proofErr w:type="gramStart"/>
-            <w:r>
-              <w:rPr>
-                <w:rFonts w:ascii="Consolas" w:eastAsia="Consolas" w:hAnsi="Consolas" w:cs="Consolas"/>
-                <w:color w:val="000000"/>
-                <w:sz w:val="20"/>
-                <w:szCs w:val="20"/>
-                <w:lang w:val="en-GB"/>
-              </w:rPr>
-              <w:t>Cuenta(</w:t>
-            </w:r>
-            <w:proofErr w:type="gramEnd"/>
-            <w:r>
-              <w:rPr>
-                <w:rFonts w:ascii="Consolas" w:eastAsia="Consolas" w:hAnsi="Consolas" w:cs="Consolas"/>
-                <w:color w:val="000000"/>
-                <w:sz w:val="20"/>
-                <w:szCs w:val="20"/>
-                <w:lang w:val="en-GB"/>
-              </w:rPr>
-              <w:t xml:space="preserve">String </w:t>
+              <w:t xml:space="preserve"> Cuenta(String </w:t>
             </w:r>
             <w:r>
               <w:rPr>
@@ -5374,7 +4763,6 @@
               </w:rPr>
               <w:t xml:space="preserve"> </w:t>
             </w:r>
-            <w:proofErr w:type="gramStart"/>
             <w:r>
               <w:rPr>
                 <w:rFonts w:ascii="Consolas" w:eastAsia="Consolas" w:hAnsi="Consolas" w:cs="Consolas"/>
@@ -5404,7 +4792,6 @@
               </w:rPr>
               <w:t>titular</w:t>
             </w:r>
-            <w:proofErr w:type="gramEnd"/>
             <w:r>
               <w:rPr>
                 <w:rFonts w:ascii="Consolas" w:eastAsia="Consolas" w:hAnsi="Consolas" w:cs="Consolas"/>
@@ -5446,7 +4833,6 @@
               </w:rPr>
               <w:t xml:space="preserve"> </w:t>
             </w:r>
-            <w:proofErr w:type="gramStart"/>
             <w:r>
               <w:rPr>
                 <w:rFonts w:ascii="Consolas" w:eastAsia="Consolas" w:hAnsi="Consolas" w:cs="Consolas"/>
@@ -5476,7 +4862,6 @@
               </w:rPr>
               <w:t>saldo</w:t>
             </w:r>
-            <w:proofErr w:type="gramEnd"/>
             <w:r>
               <w:rPr>
                 <w:rFonts w:ascii="Consolas" w:eastAsia="Consolas" w:hAnsi="Consolas" w:cs="Consolas"/>
@@ -5509,25 +4894,25 @@
             <w:pPr>
               <w:shd w:val="clear" w:color="auto" w:fill="FFFFFF"/>
               <w:rPr>
-                <w:lang w:val="en-GB"/>
-              </w:rPr>
-            </w:pPr>
-            <w:r>
-              <w:rPr>
-                <w:rFonts w:ascii="Consolas" w:eastAsia="Consolas" w:hAnsi="Consolas" w:cs="Consolas"/>
-                <w:color w:val="000000"/>
-                <w:sz w:val="20"/>
-                <w:szCs w:val="20"/>
-              </w:rPr>
-              <w:t xml:space="preserve"> </w:t>
-            </w:r>
-            <w:r>
-              <w:rPr>
-                <w:rFonts w:ascii="Consolas" w:eastAsia="Consolas" w:hAnsi="Consolas" w:cs="Consolas"/>
-                <w:color w:val="000000"/>
-                <w:sz w:val="20"/>
-                <w:szCs w:val="20"/>
-                <w:lang w:val="en-GB"/>
+                <w:lang w:val="es-ES"/>
+              </w:rPr>
+            </w:pPr>
+            <w:r>
+              <w:rPr>
+                <w:rFonts w:ascii="Consolas" w:eastAsia="Consolas" w:hAnsi="Consolas" w:cs="Consolas"/>
+                <w:color w:val="000000"/>
+                <w:sz w:val="20"/>
+                <w:szCs w:val="20"/>
+              </w:rPr>
+              <w:t xml:space="preserve"> </w:t>
+            </w:r>
+            <w:r>
+              <w:rPr>
+                <w:rFonts w:ascii="Consolas" w:eastAsia="Consolas" w:hAnsi="Consolas" w:cs="Consolas"/>
+                <w:color w:val="000000"/>
+                <w:sz w:val="20"/>
+                <w:szCs w:val="20"/>
+                <w:lang w:val="es-ES"/>
               </w:rPr>
               <w:t xml:space="preserve">} </w:t>
             </w:r>
@@ -5536,34 +4921,34 @@
             <w:pPr>
               <w:shd w:val="clear" w:color="auto" w:fill="FFFFFF"/>
               <w:rPr>
-                <w:lang w:val="en-GB"/>
-              </w:rPr>
-            </w:pPr>
-            <w:r>
-              <w:rPr>
-                <w:rFonts w:ascii="Consolas" w:eastAsia="Consolas" w:hAnsi="Consolas" w:cs="Consolas"/>
-                <w:color w:val="000000"/>
-                <w:sz w:val="20"/>
-                <w:szCs w:val="20"/>
-                <w:lang w:val="en-GB"/>
-              </w:rPr>
-              <w:t xml:space="preserve"> </w:t>
-            </w:r>
-          </w:p>
-          <w:p>
-            <w:pPr>
-              <w:shd w:val="clear" w:color="auto" w:fill="FFFFFF"/>
-              <w:rPr>
-                <w:lang w:val="en-GB"/>
-              </w:rPr>
-            </w:pPr>
-            <w:r>
-              <w:rPr>
-                <w:rFonts w:ascii="Consolas" w:eastAsia="Consolas" w:hAnsi="Consolas" w:cs="Consolas"/>
-                <w:color w:val="000000"/>
-                <w:sz w:val="20"/>
-                <w:szCs w:val="20"/>
-                <w:lang w:val="en-GB"/>
+                <w:lang w:val="es-ES"/>
+              </w:rPr>
+            </w:pPr>
+            <w:r>
+              <w:rPr>
+                <w:rFonts w:ascii="Consolas" w:eastAsia="Consolas" w:hAnsi="Consolas" w:cs="Consolas"/>
+                <w:color w:val="000000"/>
+                <w:sz w:val="20"/>
+                <w:szCs w:val="20"/>
+                <w:lang w:val="es-ES"/>
+              </w:rPr>
+              <w:t xml:space="preserve"> </w:t>
+            </w:r>
+          </w:p>
+          <w:p>
+            <w:pPr>
+              <w:shd w:val="clear" w:color="auto" w:fill="FFFFFF"/>
+              <w:rPr>
+                <w:lang w:val="es-ES"/>
+              </w:rPr>
+            </w:pPr>
+            <w:r>
+              <w:rPr>
+                <w:rFonts w:ascii="Consolas" w:eastAsia="Consolas" w:hAnsi="Consolas" w:cs="Consolas"/>
+                <w:color w:val="000000"/>
+                <w:sz w:val="20"/>
+                <w:szCs w:val="20"/>
+                <w:lang w:val="es-ES"/>
               </w:rPr>
               <w:t xml:space="preserve"> </w:t>
             </w:r>
@@ -5575,7 +4960,7 @@
                 <w:color w:val="7F0055"/>
                 <w:sz w:val="20"/>
                 <w:szCs w:val="20"/>
-                <w:lang w:val="en-GB"/>
+                <w:lang w:val="es-ES"/>
               </w:rPr>
               <w:t>public</w:t>
             </w:r>
@@ -5585,7 +4970,7 @@
                 <w:color w:val="000000"/>
                 <w:sz w:val="20"/>
                 <w:szCs w:val="20"/>
-                <w:lang w:val="en-GB"/>
+                <w:lang w:val="es-ES"/>
               </w:rPr>
               <w:t xml:space="preserve"> </w:t>
             </w:r>
@@ -5597,7 +4982,7 @@
                 <w:color w:val="7F0055"/>
                 <w:sz w:val="20"/>
                 <w:szCs w:val="20"/>
-                <w:lang w:val="en-GB"/>
+                <w:lang w:val="es-ES"/>
               </w:rPr>
               <w:t>void</w:t>
             </w:r>
@@ -5607,22 +4992,10 @@
                 <w:color w:val="000000"/>
                 <w:sz w:val="20"/>
                 <w:szCs w:val="20"/>
-                <w:lang w:val="en-GB"/>
-              </w:rPr>
-              <w:t xml:space="preserve"> </w:t>
-            </w:r>
-            <w:proofErr w:type="gramStart"/>
-            <w:r>
-              <w:rPr>
-                <w:rFonts w:ascii="Consolas" w:eastAsia="Consolas" w:hAnsi="Consolas" w:cs="Consolas"/>
-                <w:color w:val="000000"/>
-                <w:sz w:val="20"/>
-                <w:szCs w:val="20"/>
-                <w:lang w:val="en-GB"/>
-              </w:rPr>
-              <w:t>retirar(</w:t>
-            </w:r>
-            <w:proofErr w:type="gramEnd"/>
+                <w:lang w:val="es-ES"/>
+              </w:rPr>
+              <w:t xml:space="preserve"> retirar(</w:t>
+            </w:r>
             <w:r>
               <w:rPr>
                 <w:rFonts w:ascii="Consolas" w:eastAsia="Consolas" w:hAnsi="Consolas" w:cs="Consolas"/>
@@ -5631,7 +5004,7 @@
                 <w:color w:val="7F0055"/>
                 <w:sz w:val="20"/>
                 <w:szCs w:val="20"/>
-                <w:lang w:val="en-GB"/>
+                <w:lang w:val="es-ES"/>
               </w:rPr>
               <w:t>double</w:t>
             </w:r>
@@ -5641,7 +5014,7 @@
                 <w:color w:val="000000"/>
                 <w:sz w:val="20"/>
                 <w:szCs w:val="20"/>
-                <w:lang w:val="en-GB"/>
+                <w:lang w:val="es-ES"/>
               </w:rPr>
               <w:t xml:space="preserve"> </w:t>
             </w:r>
@@ -5651,7 +5024,7 @@
                 <w:color w:val="6A3E3E"/>
                 <w:sz w:val="20"/>
                 <w:szCs w:val="20"/>
-                <w:lang w:val="en-GB"/>
+                <w:lang w:val="es-ES"/>
               </w:rPr>
               <w:t>cantidad</w:t>
             </w:r>
@@ -5661,7 +5034,7 @@
                 <w:color w:val="000000"/>
                 <w:sz w:val="20"/>
                 <w:szCs w:val="20"/>
-                <w:lang w:val="en-GB"/>
+                <w:lang w:val="es-ES"/>
               </w:rPr>
               <w:t xml:space="preserve">) { </w:t>
             </w:r>
@@ -5670,16 +5043,16 @@
             <w:pPr>
               <w:shd w:val="clear" w:color="auto" w:fill="FFFFFF"/>
               <w:rPr>
-                <w:lang w:val="en-GB"/>
-              </w:rPr>
-            </w:pPr>
-            <w:r>
-              <w:rPr>
-                <w:rFonts w:ascii="Consolas" w:eastAsia="Consolas" w:hAnsi="Consolas" w:cs="Consolas"/>
-                <w:color w:val="000000"/>
-                <w:sz w:val="20"/>
-                <w:szCs w:val="20"/>
-                <w:lang w:val="en-GB"/>
+                <w:lang w:val="es-ES"/>
+              </w:rPr>
+            </w:pPr>
+            <w:r>
+              <w:rPr>
+                <w:rFonts w:ascii="Consolas" w:eastAsia="Consolas" w:hAnsi="Consolas" w:cs="Consolas"/>
+                <w:color w:val="000000"/>
+                <w:sz w:val="20"/>
+                <w:szCs w:val="20"/>
+                <w:lang w:val="es-ES"/>
               </w:rPr>
               <w:t xml:space="preserve"> </w:t>
             </w:r>
@@ -5691,7 +5064,7 @@
                 <w:color w:val="7F0055"/>
                 <w:sz w:val="20"/>
                 <w:szCs w:val="20"/>
-                <w:lang w:val="en-GB"/>
+                <w:lang w:val="es-ES"/>
               </w:rPr>
               <w:t>if</w:t>
             </w:r>
@@ -5701,7 +5074,7 @@
                 <w:color w:val="000000"/>
                 <w:sz w:val="20"/>
                 <w:szCs w:val="20"/>
-                <w:lang w:val="en-GB"/>
+                <w:lang w:val="es-ES"/>
               </w:rPr>
               <w:t xml:space="preserve"> (</w:t>
             </w:r>
@@ -5711,7 +5084,7 @@
                 <w:color w:val="6A3E3E"/>
                 <w:sz w:val="20"/>
                 <w:szCs w:val="20"/>
-                <w:lang w:val="en-GB"/>
+                <w:lang w:val="es-ES"/>
               </w:rPr>
               <w:t>cantidad</w:t>
             </w:r>
@@ -5721,7 +5094,7 @@
                 <w:color w:val="000000"/>
                 <w:sz w:val="20"/>
                 <w:szCs w:val="20"/>
-                <w:lang w:val="en-GB"/>
+                <w:lang w:val="es-ES"/>
               </w:rPr>
               <w:t xml:space="preserve"> &lt;= 0) { </w:t>
             </w:r>
@@ -5730,16 +5103,16 @@
             <w:pPr>
               <w:shd w:val="clear" w:color="auto" w:fill="FFFFFF"/>
               <w:rPr>
-                <w:lang w:val="en-GB"/>
-              </w:rPr>
-            </w:pPr>
-            <w:r>
-              <w:rPr>
-                <w:rFonts w:ascii="Consolas" w:eastAsia="Consolas" w:hAnsi="Consolas" w:cs="Consolas"/>
-                <w:color w:val="000000"/>
-                <w:sz w:val="20"/>
-                <w:szCs w:val="20"/>
-                <w:lang w:val="en-GB"/>
+                <w:lang w:val="es-ES"/>
+              </w:rPr>
+            </w:pPr>
+            <w:r>
+              <w:rPr>
+                <w:rFonts w:ascii="Consolas" w:eastAsia="Consolas" w:hAnsi="Consolas" w:cs="Consolas"/>
+                <w:color w:val="000000"/>
+                <w:sz w:val="20"/>
+                <w:szCs w:val="20"/>
+                <w:lang w:val="es-ES"/>
               </w:rPr>
               <w:t xml:space="preserve"> </w:t>
             </w:r>
@@ -5751,7 +5124,7 @@
                 <w:color w:val="7F0055"/>
                 <w:sz w:val="20"/>
                 <w:szCs w:val="20"/>
-                <w:lang w:val="en-GB"/>
+                <w:lang w:val="es-ES"/>
               </w:rPr>
               <w:t>throw</w:t>
             </w:r>
@@ -5761,7 +5134,7 @@
                 <w:color w:val="000000"/>
                 <w:sz w:val="20"/>
                 <w:szCs w:val="20"/>
-                <w:lang w:val="en-GB"/>
+                <w:lang w:val="es-ES"/>
               </w:rPr>
               <w:t xml:space="preserve"> </w:t>
             </w:r>
@@ -5773,7 +5146,7 @@
                 <w:color w:val="7F0055"/>
                 <w:sz w:val="20"/>
                 <w:szCs w:val="20"/>
-                <w:lang w:val="en-GB"/>
+                <w:lang w:val="es-ES"/>
               </w:rPr>
               <w:t>new</w:t>
             </w:r>
@@ -5783,44 +5156,22 @@
                 <w:color w:val="000000"/>
                 <w:sz w:val="20"/>
                 <w:szCs w:val="20"/>
-                <w:lang w:val="en-GB"/>
-              </w:rPr>
-              <w:t xml:space="preserve"> </w:t>
-            </w:r>
-            <w:proofErr w:type="gramStart"/>
-            <w:r>
-              <w:rPr>
-                <w:rFonts w:ascii="Consolas" w:eastAsia="Consolas" w:hAnsi="Consolas" w:cs="Consolas"/>
-                <w:color w:val="000000"/>
-                <w:sz w:val="20"/>
-                <w:szCs w:val="20"/>
-                <w:lang w:val="en-GB"/>
-              </w:rPr>
-              <w:t>IllegalArgumentException(</w:t>
-            </w:r>
-            <w:proofErr w:type="gramEnd"/>
-            <w:r>
-              <w:rPr>
-                <w:rFonts w:ascii="Consolas" w:eastAsia="Consolas" w:hAnsi="Consolas" w:cs="Consolas"/>
-                <w:color w:val="000000"/>
-                <w:sz w:val="20"/>
-                <w:szCs w:val="20"/>
-                <w:lang w:val="en-GB"/>
-              </w:rPr>
-              <w:t xml:space="preserve"> </w:t>
-            </w:r>
-          </w:p>
-          <w:p>
-            <w:pPr>
-              <w:shd w:val="clear" w:color="auto" w:fill="FFFFFF"/>
-            </w:pPr>
-            <w:r>
-              <w:rPr>
-                <w:rFonts w:ascii="Consolas" w:eastAsia="Consolas" w:hAnsi="Consolas" w:cs="Consolas"/>
-                <w:color w:val="000000"/>
-                <w:sz w:val="20"/>
-                <w:szCs w:val="20"/>
-                <w:lang w:val="en-GB"/>
+                <w:lang w:val="es-ES"/>
+              </w:rPr>
+              <w:t xml:space="preserve"> IllegalArgumentException( </w:t>
+            </w:r>
+          </w:p>
+          <w:p>
+            <w:pPr>
+              <w:shd w:val="clear" w:color="auto" w:fill="FFFFFF"/>
+            </w:pPr>
+            <w:r>
+              <w:rPr>
+                <w:rFonts w:ascii="Consolas" w:eastAsia="Consolas" w:hAnsi="Consolas" w:cs="Consolas"/>
+                <w:color w:val="000000"/>
+                <w:sz w:val="20"/>
+                <w:szCs w:val="20"/>
+                <w:lang w:val="es-ES"/>
               </w:rPr>
               <w:t xml:space="preserve"> </w:t>
             </w:r>
@@ -5903,6 +5254,7 @@
                 <w:szCs w:val="20"/>
                 <w:lang w:val="en-GB"/>
               </w:rPr>
+              <w:lastRenderedPageBreak/>
               <w:t xml:space="preserve"> </w:t>
             </w:r>
             <w:r>
@@ -6027,34 +5379,15 @@
                 <w:szCs w:val="20"/>
                 <w:lang w:val="en-GB"/>
               </w:rPr>
-              <w:t xml:space="preserve"> </w:t>
-            </w:r>
-            <w:proofErr w:type="gramStart"/>
-            <w:r>
-              <w:rPr>
-                <w:rFonts w:ascii="Consolas" w:eastAsia="Consolas" w:hAnsi="Consolas" w:cs="Consolas"/>
-                <w:color w:val="000000"/>
-                <w:sz w:val="20"/>
-                <w:szCs w:val="20"/>
-                <w:lang w:val="en-GB"/>
-              </w:rPr>
-              <w:t>IllegalStateException(</w:t>
-            </w:r>
-            <w:proofErr w:type="gramEnd"/>
-            <w:r>
-              <w:rPr>
-                <w:rFonts w:ascii="Consolas" w:eastAsia="Consolas" w:hAnsi="Consolas" w:cs="Consolas"/>
-                <w:color w:val="000000"/>
-                <w:sz w:val="20"/>
-                <w:szCs w:val="20"/>
-                <w:lang w:val="en-GB"/>
-              </w:rPr>
-              <w:t xml:space="preserve"> </w:t>
-            </w:r>
-          </w:p>
-          <w:p>
-            <w:pPr>
-              <w:shd w:val="clear" w:color="auto" w:fill="FFFFFF"/>
+              <w:t xml:space="preserve"> IllegalStateException( </w:t>
+            </w:r>
+          </w:p>
+          <w:p>
+            <w:pPr>
+              <w:shd w:val="clear" w:color="auto" w:fill="FFFFFF"/>
+              <w:rPr>
+                <w:lang w:val="en-GB"/>
+              </w:rPr>
             </w:pPr>
             <w:r>
               <w:rPr>
@@ -6072,6 +5405,7 @@
                 <w:color w:val="2A00FF"/>
                 <w:sz w:val="20"/>
                 <w:szCs w:val="20"/>
+                <w:lang w:val="en-GB"/>
               </w:rPr>
               <w:t>"Saldo insuficiente"</w:t>
             </w:r>
@@ -6081,6 +5415,7 @@
                 <w:color w:val="000000"/>
                 <w:sz w:val="20"/>
                 <w:szCs w:val="20"/>
+                <w:lang w:val="en-GB"/>
               </w:rPr>
               <w:t xml:space="preserve">); </w:t>
             </w:r>
@@ -6095,22 +5430,31 @@
                 <w:color w:val="000000"/>
                 <w:sz w:val="20"/>
                 <w:szCs w:val="20"/>
-              </w:rPr>
-              <w:t xml:space="preserve"> } </w:t>
-            </w:r>
-          </w:p>
-          <w:p>
-            <w:pPr>
-              <w:shd w:val="clear" w:color="auto" w:fill="FFFFFF"/>
-            </w:pPr>
-            <w:r>
-              <w:rPr>
-                <w:rFonts w:ascii="Consolas" w:eastAsia="Consolas" w:hAnsi="Consolas" w:cs="Consolas"/>
-                <w:color w:val="000000"/>
-                <w:sz w:val="20"/>
-                <w:szCs w:val="20"/>
-              </w:rPr>
-              <w:lastRenderedPageBreak/>
+                <w:lang w:val="en-GB"/>
+              </w:rPr>
+              <w:t xml:space="preserve"> </w:t>
+            </w:r>
+            <w:r>
+              <w:rPr>
+                <w:rFonts w:ascii="Consolas" w:eastAsia="Consolas" w:hAnsi="Consolas" w:cs="Consolas"/>
+                <w:color w:val="000000"/>
+                <w:sz w:val="20"/>
+                <w:szCs w:val="20"/>
+              </w:rPr>
+              <w:t xml:space="preserve">} </w:t>
+            </w:r>
+          </w:p>
+          <w:p>
+            <w:pPr>
+              <w:shd w:val="clear" w:color="auto" w:fill="FFFFFF"/>
+            </w:pPr>
+            <w:r>
+              <w:rPr>
+                <w:rFonts w:ascii="Consolas" w:eastAsia="Consolas" w:hAnsi="Consolas" w:cs="Consolas"/>
+                <w:color w:val="000000"/>
+                <w:sz w:val="20"/>
+                <w:szCs w:val="20"/>
+              </w:rPr>
               <w:t xml:space="preserve"> </w:t>
             </w:r>
           </w:p>
@@ -6243,19 +5587,8 @@
                 <w:sz w:val="20"/>
                 <w:szCs w:val="20"/>
               </w:rPr>
-              <w:t xml:space="preserve"> </w:t>
-            </w:r>
-            <w:proofErr w:type="gramStart"/>
-            <w:r>
-              <w:rPr>
-                <w:rFonts w:ascii="Consolas" w:eastAsia="Consolas" w:hAnsi="Consolas" w:cs="Consolas"/>
-                <w:color w:val="000000"/>
-                <w:sz w:val="20"/>
-                <w:szCs w:val="20"/>
-              </w:rPr>
-              <w:t>ingresar(</w:t>
-            </w:r>
-            <w:proofErr w:type="gramEnd"/>
+              <w:t xml:space="preserve"> ingresar(</w:t>
+            </w:r>
             <w:r>
               <w:rPr>
                 <w:rFonts w:ascii="Consolas" w:eastAsia="Consolas" w:hAnsi="Consolas" w:cs="Consolas"/>
@@ -6299,7 +5632,7 @@
             <w:pPr>
               <w:shd w:val="clear" w:color="auto" w:fill="FFFFFF"/>
               <w:rPr>
-                <w:lang w:val="en-GB"/>
+                <w:lang w:val="es-ES"/>
               </w:rPr>
             </w:pPr>
             <w:r>
@@ -6319,7 +5652,7 @@
                 <w:color w:val="7F0055"/>
                 <w:sz w:val="20"/>
                 <w:szCs w:val="20"/>
-                <w:lang w:val="en-GB"/>
+                <w:lang w:val="es-ES"/>
               </w:rPr>
               <w:t>if</w:t>
             </w:r>
@@ -6329,7 +5662,7 @@
                 <w:color w:val="000000"/>
                 <w:sz w:val="20"/>
                 <w:szCs w:val="20"/>
-                <w:lang w:val="en-GB"/>
+                <w:lang w:val="es-ES"/>
               </w:rPr>
               <w:t xml:space="preserve"> (</w:t>
             </w:r>
@@ -6339,7 +5672,7 @@
                 <w:color w:val="6A3E3E"/>
                 <w:sz w:val="20"/>
                 <w:szCs w:val="20"/>
-                <w:lang w:val="en-GB"/>
+                <w:lang w:val="es-ES"/>
               </w:rPr>
               <w:t>cantidad</w:t>
             </w:r>
@@ -6349,7 +5682,7 @@
                 <w:color w:val="000000"/>
                 <w:sz w:val="20"/>
                 <w:szCs w:val="20"/>
-                <w:lang w:val="en-GB"/>
+                <w:lang w:val="es-ES"/>
               </w:rPr>
               <w:t xml:space="preserve"> &lt;= 0) { </w:t>
             </w:r>
@@ -6358,16 +5691,16 @@
             <w:pPr>
               <w:shd w:val="clear" w:color="auto" w:fill="FFFFFF"/>
               <w:rPr>
-                <w:lang w:val="en-GB"/>
-              </w:rPr>
-            </w:pPr>
-            <w:r>
-              <w:rPr>
-                <w:rFonts w:ascii="Consolas" w:eastAsia="Consolas" w:hAnsi="Consolas" w:cs="Consolas"/>
-                <w:color w:val="000000"/>
-                <w:sz w:val="20"/>
-                <w:szCs w:val="20"/>
-                <w:lang w:val="en-GB"/>
+                <w:lang w:val="es-ES"/>
+              </w:rPr>
+            </w:pPr>
+            <w:r>
+              <w:rPr>
+                <w:rFonts w:ascii="Consolas" w:eastAsia="Consolas" w:hAnsi="Consolas" w:cs="Consolas"/>
+                <w:color w:val="000000"/>
+                <w:sz w:val="20"/>
+                <w:szCs w:val="20"/>
+                <w:lang w:val="es-ES"/>
               </w:rPr>
               <w:t xml:space="preserve"> </w:t>
             </w:r>
@@ -6379,7 +5712,7 @@
                 <w:color w:val="7F0055"/>
                 <w:sz w:val="20"/>
                 <w:szCs w:val="20"/>
-                <w:lang w:val="en-GB"/>
+                <w:lang w:val="es-ES"/>
               </w:rPr>
               <w:t>throw</w:t>
             </w:r>
@@ -6389,7 +5722,7 @@
                 <w:color w:val="000000"/>
                 <w:sz w:val="20"/>
                 <w:szCs w:val="20"/>
-                <w:lang w:val="en-GB"/>
+                <w:lang w:val="es-ES"/>
               </w:rPr>
               <w:t xml:space="preserve"> </w:t>
             </w:r>
@@ -6401,7 +5734,7 @@
                 <w:color w:val="7F0055"/>
                 <w:sz w:val="20"/>
                 <w:szCs w:val="20"/>
-                <w:lang w:val="en-GB"/>
+                <w:lang w:val="es-ES"/>
               </w:rPr>
               <w:t>new</w:t>
             </w:r>
@@ -6411,44 +5744,22 @@
                 <w:color w:val="000000"/>
                 <w:sz w:val="20"/>
                 <w:szCs w:val="20"/>
-                <w:lang w:val="en-GB"/>
-              </w:rPr>
-              <w:t xml:space="preserve"> </w:t>
-            </w:r>
-            <w:proofErr w:type="gramStart"/>
-            <w:r>
-              <w:rPr>
-                <w:rFonts w:ascii="Consolas" w:eastAsia="Consolas" w:hAnsi="Consolas" w:cs="Consolas"/>
-                <w:color w:val="000000"/>
-                <w:sz w:val="20"/>
-                <w:szCs w:val="20"/>
-                <w:lang w:val="en-GB"/>
-              </w:rPr>
-              <w:t>IllegalArgumentException(</w:t>
-            </w:r>
-            <w:proofErr w:type="gramEnd"/>
-            <w:r>
-              <w:rPr>
-                <w:rFonts w:ascii="Consolas" w:eastAsia="Consolas" w:hAnsi="Consolas" w:cs="Consolas"/>
-                <w:color w:val="000000"/>
-                <w:sz w:val="20"/>
-                <w:szCs w:val="20"/>
-                <w:lang w:val="en-GB"/>
-              </w:rPr>
-              <w:t xml:space="preserve"> </w:t>
-            </w:r>
-          </w:p>
-          <w:p>
-            <w:pPr>
-              <w:shd w:val="clear" w:color="auto" w:fill="FFFFFF"/>
-            </w:pPr>
-            <w:r>
-              <w:rPr>
-                <w:rFonts w:ascii="Consolas" w:eastAsia="Consolas" w:hAnsi="Consolas" w:cs="Consolas"/>
-                <w:color w:val="000000"/>
-                <w:sz w:val="20"/>
-                <w:szCs w:val="20"/>
-                <w:lang w:val="en-GB"/>
+                <w:lang w:val="es-ES"/>
+              </w:rPr>
+              <w:t xml:space="preserve"> IllegalArgumentException( </w:t>
+            </w:r>
+          </w:p>
+          <w:p>
+            <w:pPr>
+              <w:shd w:val="clear" w:color="auto" w:fill="FFFFFF"/>
+            </w:pPr>
+            <w:r>
+              <w:rPr>
+                <w:rFonts w:ascii="Consolas" w:eastAsia="Consolas" w:hAnsi="Consolas" w:cs="Consolas"/>
+                <w:color w:val="000000"/>
+                <w:sz w:val="20"/>
+                <w:szCs w:val="20"/>
+                <w:lang w:val="es-ES"/>
               </w:rPr>
               <w:t xml:space="preserve"> </w:t>
             </w:r>
@@ -6669,29 +5980,7 @@
                 <w:szCs w:val="20"/>
                 <w:lang w:val="en-GB"/>
               </w:rPr>
-              <w:t xml:space="preserve"> </w:t>
-            </w:r>
-            <w:proofErr w:type="gramStart"/>
-            <w:r>
-              <w:rPr>
-                <w:rFonts w:ascii="Consolas" w:eastAsia="Consolas" w:hAnsi="Consolas" w:cs="Consolas"/>
-                <w:color w:val="000000"/>
-                <w:sz w:val="20"/>
-                <w:szCs w:val="20"/>
-                <w:lang w:val="en-GB"/>
-              </w:rPr>
-              <w:t>getSaldo(</w:t>
-            </w:r>
-            <w:proofErr w:type="gramEnd"/>
-            <w:r>
-              <w:rPr>
-                <w:rFonts w:ascii="Consolas" w:eastAsia="Consolas" w:hAnsi="Consolas" w:cs="Consolas"/>
-                <w:color w:val="000000"/>
-                <w:sz w:val="20"/>
-                <w:szCs w:val="20"/>
-                <w:lang w:val="en-GB"/>
-              </w:rPr>
-              <w:t xml:space="preserve">) { </w:t>
+              <w:t xml:space="preserve"> getSaldo() { </w:t>
             </w:r>
           </w:p>
           <w:p>
@@ -6827,29 +6116,7 @@
                 <w:szCs w:val="20"/>
                 <w:lang w:val="en-GB"/>
               </w:rPr>
-              <w:t xml:space="preserve"> String </w:t>
-            </w:r>
-            <w:proofErr w:type="gramStart"/>
-            <w:r>
-              <w:rPr>
-                <w:rFonts w:ascii="Consolas" w:eastAsia="Consolas" w:hAnsi="Consolas" w:cs="Consolas"/>
-                <w:color w:val="000000"/>
-                <w:sz w:val="20"/>
-                <w:szCs w:val="20"/>
-                <w:lang w:val="en-GB"/>
-              </w:rPr>
-              <w:t>getTitular(</w:t>
-            </w:r>
-            <w:proofErr w:type="gramEnd"/>
-            <w:r>
-              <w:rPr>
-                <w:rFonts w:ascii="Consolas" w:eastAsia="Consolas" w:hAnsi="Consolas" w:cs="Consolas"/>
-                <w:color w:val="000000"/>
-                <w:sz w:val="20"/>
-                <w:szCs w:val="20"/>
-                <w:lang w:val="en-GB"/>
-              </w:rPr>
-              <w:t xml:space="preserve">) { </w:t>
+              <w:t xml:space="preserve"> String getTitular() { </w:t>
             </w:r>
           </w:p>
           <w:p>
@@ -7108,27 +6375,7 @@
                 <w:sz w:val="20"/>
                 <w:szCs w:val="20"/>
               </w:rPr>
-              <w:t xml:space="preserve"> </w:t>
-            </w:r>
-            <w:proofErr w:type="gramStart"/>
-            <w:r>
-              <w:rPr>
-                <w:rFonts w:ascii="Consolas" w:eastAsia="Consolas" w:hAnsi="Consolas" w:cs="Consolas"/>
-                <w:color w:val="000000"/>
-                <w:sz w:val="20"/>
-                <w:szCs w:val="20"/>
-              </w:rPr>
-              <w:t>transferir(</w:t>
-            </w:r>
-            <w:proofErr w:type="gramEnd"/>
-            <w:r>
-              <w:rPr>
-                <w:rFonts w:ascii="Consolas" w:eastAsia="Consolas" w:hAnsi="Consolas" w:cs="Consolas"/>
-                <w:color w:val="000000"/>
-                <w:sz w:val="20"/>
-                <w:szCs w:val="20"/>
-              </w:rPr>
-              <w:t xml:space="preserve">Cuenta </w:t>
+              <w:t xml:space="preserve"> transferir(Cuenta </w:t>
             </w:r>
             <w:r>
               <w:rPr>
@@ -7442,27 +6689,7 @@
                 <w:sz w:val="20"/>
                 <w:szCs w:val="20"/>
               </w:rPr>
-              <w:t xml:space="preserve"> </w:t>
-            </w:r>
-            <w:proofErr w:type="gramStart"/>
-            <w:r>
-              <w:rPr>
-                <w:rFonts w:ascii="Consolas" w:eastAsia="Consolas" w:hAnsi="Consolas" w:cs="Consolas"/>
-                <w:color w:val="000000"/>
-                <w:sz w:val="20"/>
-                <w:szCs w:val="20"/>
-              </w:rPr>
-              <w:t>IllegalArgumentException(</w:t>
-            </w:r>
-            <w:proofErr w:type="gramEnd"/>
-            <w:r>
-              <w:rPr>
-                <w:rFonts w:ascii="Consolas" w:eastAsia="Consolas" w:hAnsi="Consolas" w:cs="Consolas"/>
-                <w:color w:val="000000"/>
-                <w:sz w:val="20"/>
-                <w:szCs w:val="20"/>
-              </w:rPr>
-              <w:t xml:space="preserve"> </w:t>
+              <w:t xml:space="preserve"> IllegalArgumentException( </w:t>
             </w:r>
           </w:p>
           <w:p>
@@ -7501,25 +6728,25 @@
             <w:pPr>
               <w:shd w:val="clear" w:color="auto" w:fill="FFFFFF"/>
               <w:rPr>
-                <w:lang w:val="en-GB"/>
-              </w:rPr>
-            </w:pPr>
-            <w:r>
-              <w:rPr>
-                <w:rFonts w:ascii="Consolas" w:eastAsia="Consolas" w:hAnsi="Consolas" w:cs="Consolas"/>
-                <w:color w:val="000000"/>
-                <w:sz w:val="20"/>
-                <w:szCs w:val="20"/>
-              </w:rPr>
-              <w:t xml:space="preserve"> </w:t>
-            </w:r>
-            <w:r>
-              <w:rPr>
-                <w:rFonts w:ascii="Consolas" w:eastAsia="Consolas" w:hAnsi="Consolas" w:cs="Consolas"/>
-                <w:color w:val="000000"/>
-                <w:sz w:val="20"/>
-                <w:szCs w:val="20"/>
-                <w:lang w:val="en-GB"/>
+                <w:lang w:val="es-ES"/>
+              </w:rPr>
+            </w:pPr>
+            <w:r>
+              <w:rPr>
+                <w:rFonts w:ascii="Consolas" w:eastAsia="Consolas" w:hAnsi="Consolas" w:cs="Consolas"/>
+                <w:color w:val="000000"/>
+                <w:sz w:val="20"/>
+                <w:szCs w:val="20"/>
+              </w:rPr>
+              <w:t xml:space="preserve"> </w:t>
+            </w:r>
+            <w:r>
+              <w:rPr>
+                <w:rFonts w:ascii="Consolas" w:eastAsia="Consolas" w:hAnsi="Consolas" w:cs="Consolas"/>
+                <w:color w:val="000000"/>
+                <w:sz w:val="20"/>
+                <w:szCs w:val="20"/>
+                <w:lang w:val="es-ES"/>
               </w:rPr>
               <w:t xml:space="preserve">} </w:t>
             </w:r>
@@ -7528,34 +6755,34 @@
             <w:pPr>
               <w:shd w:val="clear" w:color="auto" w:fill="FFFFFF"/>
               <w:rPr>
-                <w:lang w:val="en-GB"/>
-              </w:rPr>
-            </w:pPr>
-            <w:r>
-              <w:rPr>
-                <w:rFonts w:ascii="Consolas" w:eastAsia="Consolas" w:hAnsi="Consolas" w:cs="Consolas"/>
-                <w:color w:val="000000"/>
-                <w:sz w:val="20"/>
-                <w:szCs w:val="20"/>
-                <w:lang w:val="en-GB"/>
-              </w:rPr>
-              <w:t xml:space="preserve"> </w:t>
-            </w:r>
-          </w:p>
-          <w:p>
-            <w:pPr>
-              <w:shd w:val="clear" w:color="auto" w:fill="FFFFFF"/>
-              <w:rPr>
-                <w:lang w:val="en-GB"/>
-              </w:rPr>
-            </w:pPr>
-            <w:r>
-              <w:rPr>
-                <w:rFonts w:ascii="Consolas" w:eastAsia="Consolas" w:hAnsi="Consolas" w:cs="Consolas"/>
-                <w:color w:val="000000"/>
-                <w:sz w:val="20"/>
-                <w:szCs w:val="20"/>
-                <w:lang w:val="en-GB"/>
+                <w:lang w:val="es-ES"/>
+              </w:rPr>
+            </w:pPr>
+            <w:r>
+              <w:rPr>
+                <w:rFonts w:ascii="Consolas" w:eastAsia="Consolas" w:hAnsi="Consolas" w:cs="Consolas"/>
+                <w:color w:val="000000"/>
+                <w:sz w:val="20"/>
+                <w:szCs w:val="20"/>
+                <w:lang w:val="es-ES"/>
+              </w:rPr>
+              <w:t xml:space="preserve"> </w:t>
+            </w:r>
+          </w:p>
+          <w:p>
+            <w:pPr>
+              <w:shd w:val="clear" w:color="auto" w:fill="FFFFFF"/>
+              <w:rPr>
+                <w:lang w:val="es-ES"/>
+              </w:rPr>
+            </w:pPr>
+            <w:r>
+              <w:rPr>
+                <w:rFonts w:ascii="Consolas" w:eastAsia="Consolas" w:hAnsi="Consolas" w:cs="Consolas"/>
+                <w:color w:val="000000"/>
+                <w:sz w:val="20"/>
+                <w:szCs w:val="20"/>
+                <w:lang w:val="es-ES"/>
               </w:rPr>
               <w:t xml:space="preserve"> </w:t>
             </w:r>
@@ -7567,7 +6794,7 @@
                 <w:color w:val="7F0055"/>
                 <w:sz w:val="20"/>
                 <w:szCs w:val="20"/>
-                <w:lang w:val="en-GB"/>
+                <w:lang w:val="es-ES"/>
               </w:rPr>
               <w:t>if</w:t>
             </w:r>
@@ -7577,7 +6804,7 @@
                 <w:color w:val="000000"/>
                 <w:sz w:val="20"/>
                 <w:szCs w:val="20"/>
-                <w:lang w:val="en-GB"/>
+                <w:lang w:val="es-ES"/>
               </w:rPr>
               <w:t xml:space="preserve"> (</w:t>
             </w:r>
@@ -7587,7 +6814,7 @@
                 <w:color w:val="6A3E3E"/>
                 <w:sz w:val="20"/>
                 <w:szCs w:val="20"/>
-                <w:lang w:val="en-GB"/>
+                <w:lang w:val="es-ES"/>
               </w:rPr>
               <w:t>cantidad</w:t>
             </w:r>
@@ -7597,7 +6824,7 @@
                 <w:color w:val="000000"/>
                 <w:sz w:val="20"/>
                 <w:szCs w:val="20"/>
-                <w:lang w:val="en-GB"/>
+                <w:lang w:val="es-ES"/>
               </w:rPr>
               <w:t xml:space="preserve"> &lt;= 0) { </w:t>
             </w:r>
@@ -7606,16 +6833,16 @@
             <w:pPr>
               <w:shd w:val="clear" w:color="auto" w:fill="FFFFFF"/>
               <w:rPr>
-                <w:lang w:val="en-GB"/>
-              </w:rPr>
-            </w:pPr>
-            <w:r>
-              <w:rPr>
-                <w:rFonts w:ascii="Consolas" w:eastAsia="Consolas" w:hAnsi="Consolas" w:cs="Consolas"/>
-                <w:color w:val="000000"/>
-                <w:sz w:val="20"/>
-                <w:szCs w:val="20"/>
-                <w:lang w:val="en-GB"/>
+                <w:lang w:val="es-ES"/>
+              </w:rPr>
+            </w:pPr>
+            <w:r>
+              <w:rPr>
+                <w:rFonts w:ascii="Consolas" w:eastAsia="Consolas" w:hAnsi="Consolas" w:cs="Consolas"/>
+                <w:color w:val="000000"/>
+                <w:sz w:val="20"/>
+                <w:szCs w:val="20"/>
+                <w:lang w:val="es-ES"/>
               </w:rPr>
               <w:t xml:space="preserve"> </w:t>
             </w:r>
@@ -7627,7 +6854,7 @@
                 <w:color w:val="7F0055"/>
                 <w:sz w:val="20"/>
                 <w:szCs w:val="20"/>
-                <w:lang w:val="en-GB"/>
+                <w:lang w:val="es-ES"/>
               </w:rPr>
               <w:t>throw</w:t>
             </w:r>
@@ -7637,7 +6864,7 @@
                 <w:color w:val="000000"/>
                 <w:sz w:val="20"/>
                 <w:szCs w:val="20"/>
-                <w:lang w:val="en-GB"/>
+                <w:lang w:val="es-ES"/>
               </w:rPr>
               <w:t xml:space="preserve"> </w:t>
             </w:r>
@@ -7649,7 +6876,7 @@
                 <w:color w:val="7F0055"/>
                 <w:sz w:val="20"/>
                 <w:szCs w:val="20"/>
-                <w:lang w:val="en-GB"/>
+                <w:lang w:val="es-ES"/>
               </w:rPr>
               <w:t>new</w:t>
             </w:r>
@@ -7659,44 +6886,22 @@
                 <w:color w:val="000000"/>
                 <w:sz w:val="20"/>
                 <w:szCs w:val="20"/>
-                <w:lang w:val="en-GB"/>
-              </w:rPr>
-              <w:t xml:space="preserve"> </w:t>
-            </w:r>
-            <w:proofErr w:type="gramStart"/>
-            <w:r>
-              <w:rPr>
-                <w:rFonts w:ascii="Consolas" w:eastAsia="Consolas" w:hAnsi="Consolas" w:cs="Consolas"/>
-                <w:color w:val="000000"/>
-                <w:sz w:val="20"/>
-                <w:szCs w:val="20"/>
-                <w:lang w:val="en-GB"/>
-              </w:rPr>
-              <w:t>IllegalArgumentException(</w:t>
-            </w:r>
-            <w:proofErr w:type="gramEnd"/>
-            <w:r>
-              <w:rPr>
-                <w:rFonts w:ascii="Consolas" w:eastAsia="Consolas" w:hAnsi="Consolas" w:cs="Consolas"/>
-                <w:color w:val="000000"/>
-                <w:sz w:val="20"/>
-                <w:szCs w:val="20"/>
-                <w:lang w:val="en-GB"/>
-              </w:rPr>
-              <w:t xml:space="preserve"> </w:t>
-            </w:r>
-          </w:p>
-          <w:p>
-            <w:pPr>
-              <w:shd w:val="clear" w:color="auto" w:fill="FFFFFF"/>
-            </w:pPr>
-            <w:r>
-              <w:rPr>
-                <w:rFonts w:ascii="Consolas" w:eastAsia="Consolas" w:hAnsi="Consolas" w:cs="Consolas"/>
-                <w:color w:val="000000"/>
-                <w:sz w:val="20"/>
-                <w:szCs w:val="20"/>
-                <w:lang w:val="en-GB"/>
+                <w:lang w:val="es-ES"/>
+              </w:rPr>
+              <w:t xml:space="preserve"> IllegalArgumentException( </w:t>
+            </w:r>
+          </w:p>
+          <w:p>
+            <w:pPr>
+              <w:shd w:val="clear" w:color="auto" w:fill="FFFFFF"/>
+            </w:pPr>
+            <w:r>
+              <w:rPr>
+                <w:rFonts w:ascii="Consolas" w:eastAsia="Consolas" w:hAnsi="Consolas" w:cs="Consolas"/>
+                <w:color w:val="000000"/>
+                <w:sz w:val="20"/>
+                <w:szCs w:val="20"/>
+                <w:lang w:val="es-ES"/>
               </w:rPr>
               <w:t xml:space="preserve"> </w:t>
             </w:r>
@@ -7803,7 +7008,6 @@
               </w:rPr>
               <w:t xml:space="preserve"> (</w:t>
             </w:r>
-            <w:proofErr w:type="gramStart"/>
             <w:r>
               <w:rPr>
                 <w:rFonts w:ascii="Consolas" w:eastAsia="Consolas" w:hAnsi="Consolas" w:cs="Consolas"/>
@@ -7822,18 +7026,7 @@
                 <w:szCs w:val="20"/>
                 <w:lang w:val="en-GB"/>
               </w:rPr>
-              <w:t>.getSaldo</w:t>
-            </w:r>
-            <w:proofErr w:type="gramEnd"/>
-            <w:r>
-              <w:rPr>
-                <w:rFonts w:ascii="Consolas" w:eastAsia="Consolas" w:hAnsi="Consolas" w:cs="Consolas"/>
-                <w:color w:val="000000"/>
-                <w:sz w:val="20"/>
-                <w:szCs w:val="20"/>
-                <w:lang w:val="en-GB"/>
-              </w:rPr>
-              <w:t xml:space="preserve">() &lt; </w:t>
+              <w:t xml:space="preserve">.getSaldo() &lt; </w:t>
             </w:r>
             <w:r>
               <w:rPr>
@@ -7915,29 +7108,7 @@
                 <w:szCs w:val="20"/>
                 <w:lang w:val="en-GB"/>
               </w:rPr>
-              <w:t xml:space="preserve"> </w:t>
-            </w:r>
-            <w:proofErr w:type="gramStart"/>
-            <w:r>
-              <w:rPr>
-                <w:rFonts w:ascii="Consolas" w:eastAsia="Consolas" w:hAnsi="Consolas" w:cs="Consolas"/>
-                <w:color w:val="000000"/>
-                <w:sz w:val="20"/>
-                <w:szCs w:val="20"/>
-                <w:lang w:val="en-GB"/>
-              </w:rPr>
-              <w:t>TransferenciaException(</w:t>
-            </w:r>
-            <w:proofErr w:type="gramEnd"/>
-            <w:r>
-              <w:rPr>
-                <w:rFonts w:ascii="Consolas" w:eastAsia="Consolas" w:hAnsi="Consolas" w:cs="Consolas"/>
-                <w:color w:val="000000"/>
-                <w:sz w:val="20"/>
-                <w:szCs w:val="20"/>
-                <w:lang w:val="en-GB"/>
-              </w:rPr>
-              <w:t xml:space="preserve"> </w:t>
+              <w:t xml:space="preserve"> TransferenciaException( </w:t>
             </w:r>
           </w:p>
           <w:p>
@@ -8014,7 +7185,6 @@
               </w:rPr>
               <w:t xml:space="preserve"> </w:t>
             </w:r>
-            <w:proofErr w:type="gramStart"/>
             <w:r>
               <w:rPr>
                 <w:rFonts w:ascii="Consolas" w:eastAsia="Consolas" w:hAnsi="Consolas" w:cs="Consolas"/>
@@ -8031,17 +7201,7 @@
                 <w:sz w:val="20"/>
                 <w:szCs w:val="20"/>
               </w:rPr>
-              <w:t>.retirar</w:t>
-            </w:r>
-            <w:proofErr w:type="gramEnd"/>
-            <w:r>
-              <w:rPr>
-                <w:rFonts w:ascii="Consolas" w:eastAsia="Consolas" w:hAnsi="Consolas" w:cs="Consolas"/>
-                <w:color w:val="000000"/>
-                <w:sz w:val="20"/>
-                <w:szCs w:val="20"/>
-              </w:rPr>
-              <w:t>(</w:t>
+              <w:t>.retirar(</w:t>
             </w:r>
             <w:r>
               <w:rPr>
@@ -8075,7 +7235,6 @@
               </w:rPr>
               <w:t xml:space="preserve"> </w:t>
             </w:r>
-            <w:proofErr w:type="gramStart"/>
             <w:r>
               <w:rPr>
                 <w:rFonts w:ascii="Consolas" w:eastAsia="Consolas" w:hAnsi="Consolas" w:cs="Consolas"/>
@@ -8092,17 +7251,7 @@
                 <w:sz w:val="20"/>
                 <w:szCs w:val="20"/>
               </w:rPr>
-              <w:t>.ingresar</w:t>
-            </w:r>
-            <w:proofErr w:type="gramEnd"/>
-            <w:r>
-              <w:rPr>
-                <w:rFonts w:ascii="Consolas" w:eastAsia="Consolas" w:hAnsi="Consolas" w:cs="Consolas"/>
-                <w:color w:val="000000"/>
-                <w:sz w:val="20"/>
-                <w:szCs w:val="20"/>
-              </w:rPr>
-              <w:t>(</w:t>
+              <w:t>.ingresar(</w:t>
             </w:r>
             <w:r>
               <w:rPr>
@@ -8193,6 +7342,7 @@
                 <w:szCs w:val="20"/>
                 <w:lang w:val="en-GB"/>
               </w:rPr>
+              <w:lastRenderedPageBreak/>
               <w:t>package</w:t>
             </w:r>
             <w:r>
@@ -8342,7 +7492,6 @@
                 <w:szCs w:val="20"/>
                 <w:lang w:val="en-GB"/>
               </w:rPr>
-              <w:lastRenderedPageBreak/>
               <w:t xml:space="preserve"> </w:t>
             </w:r>
             <w:r>
@@ -8365,29 +7514,7 @@
                 <w:szCs w:val="20"/>
                 <w:lang w:val="en-GB"/>
               </w:rPr>
-              <w:t xml:space="preserve"> </w:t>
-            </w:r>
-            <w:proofErr w:type="gramStart"/>
-            <w:r>
-              <w:rPr>
-                <w:rFonts w:ascii="Consolas" w:eastAsia="Consolas" w:hAnsi="Consolas" w:cs="Consolas"/>
-                <w:color w:val="000000"/>
-                <w:sz w:val="20"/>
-                <w:szCs w:val="20"/>
-                <w:lang w:val="en-GB"/>
-              </w:rPr>
-              <w:t>TransferenciaException(</w:t>
-            </w:r>
-            <w:proofErr w:type="gramEnd"/>
-            <w:r>
-              <w:rPr>
-                <w:rFonts w:ascii="Consolas" w:eastAsia="Consolas" w:hAnsi="Consolas" w:cs="Consolas"/>
-                <w:color w:val="000000"/>
-                <w:sz w:val="20"/>
-                <w:szCs w:val="20"/>
-                <w:lang w:val="en-GB"/>
-              </w:rPr>
-              <w:t xml:space="preserve">String </w:t>
+              <w:t xml:space="preserve"> TransferenciaException(String </w:t>
             </w:r>
             <w:r>
               <w:rPr>
@@ -8571,29 +7698,7 @@
                 <w:szCs w:val="20"/>
                 <w:lang w:val="en-GB"/>
               </w:rPr>
-              <w:t xml:space="preserve"> </w:t>
-            </w:r>
-            <w:proofErr w:type="gramStart"/>
-            <w:r>
-              <w:rPr>
-                <w:rFonts w:ascii="Consolas" w:eastAsia="Consolas" w:hAnsi="Consolas" w:cs="Consolas"/>
-                <w:color w:val="000000"/>
-                <w:sz w:val="20"/>
-                <w:szCs w:val="20"/>
-                <w:lang w:val="en-GB"/>
-              </w:rPr>
-              <w:t>java.io.FileReader</w:t>
-            </w:r>
-            <w:proofErr w:type="gramEnd"/>
-            <w:r>
-              <w:rPr>
-                <w:rFonts w:ascii="Consolas" w:eastAsia="Consolas" w:hAnsi="Consolas" w:cs="Consolas"/>
-                <w:color w:val="000000"/>
-                <w:sz w:val="20"/>
-                <w:szCs w:val="20"/>
-                <w:lang w:val="en-GB"/>
-              </w:rPr>
-              <w:t xml:space="preserve">; </w:t>
+              <w:t xml:space="preserve"> java.io.FileReader; </w:t>
             </w:r>
           </w:p>
           <w:p>
@@ -8709,29 +7814,7 @@
                 <w:szCs w:val="20"/>
                 <w:lang w:val="en-GB"/>
               </w:rPr>
-              <w:t xml:space="preserve"> </w:t>
-            </w:r>
-            <w:proofErr w:type="gramStart"/>
-            <w:r>
-              <w:rPr>
-                <w:rFonts w:ascii="Consolas" w:eastAsia="Consolas" w:hAnsi="Consolas" w:cs="Consolas"/>
-                <w:color w:val="000000"/>
-                <w:sz w:val="20"/>
-                <w:szCs w:val="20"/>
-                <w:lang w:val="en-GB"/>
-              </w:rPr>
-              <w:t>comprobarFichero(</w:t>
-            </w:r>
-            <w:proofErr w:type="gramEnd"/>
-            <w:r>
-              <w:rPr>
-                <w:rFonts w:ascii="Consolas" w:eastAsia="Consolas" w:hAnsi="Consolas" w:cs="Consolas"/>
-                <w:color w:val="000000"/>
-                <w:sz w:val="20"/>
-                <w:szCs w:val="20"/>
-                <w:lang w:val="en-GB"/>
-              </w:rPr>
-              <w:t xml:space="preserve">) { </w:t>
+              <w:t xml:space="preserve"> comprobarFichero() { </w:t>
             </w:r>
           </w:p>
           <w:p>
@@ -8890,7 +7973,6 @@
             <w:pPr>
               <w:shd w:val="clear" w:color="auto" w:fill="FFFFFF"/>
             </w:pPr>
-            <w:proofErr w:type="gramStart"/>
             <w:r>
               <w:rPr>
                 <w:rFonts w:ascii="Consolas" w:eastAsia="Consolas" w:hAnsi="Consolas" w:cs="Consolas"/>
@@ -8909,18 +7991,7 @@
                 <w:szCs w:val="20"/>
                 <w:u w:val="single"/>
               </w:rPr>
-              <w:t>.close</w:t>
-            </w:r>
-            <w:proofErr w:type="gramEnd"/>
-            <w:r>
-              <w:rPr>
-                <w:rFonts w:ascii="Consolas" w:eastAsia="Consolas" w:hAnsi="Consolas" w:cs="Consolas"/>
-                <w:color w:val="000000"/>
-                <w:sz w:val="20"/>
-                <w:szCs w:val="20"/>
-                <w:u w:val="single"/>
-              </w:rPr>
-              <w:t>()</w:t>
+              <w:t>.close()</w:t>
             </w:r>
             <w:r>
               <w:rPr>
@@ -8972,23 +8043,7 @@
     <w:p/>
     <w:p>
       <w:r>
-        <w:t xml:space="preserve">Soluciona los errores de compilación y aplica </w:t>
-      </w:r>
-      <w:proofErr w:type="gramStart"/>
-      <w:r>
-        <w:t>las  buenas</w:t>
-      </w:r>
-      <w:proofErr w:type="gramEnd"/>
-      <w:r>
-        <w:t xml:space="preserve"> prácticas </w:t>
-      </w:r>
-      <w:proofErr w:type="gramStart"/>
-      <w:r>
-        <w:t>explicadas</w:t>
-      </w:r>
-      <w:proofErr w:type="gramEnd"/>
-      <w:r>
-        <w:t xml:space="preserve"> así como el principio de que la excepción sea tratada donde se pueda decidir qué hacer.</w:t>
+        <w:t>Soluciona los errores de compilación y aplica las  buenas prácticas explicadas así como el principio de que la excepción sea tratada donde se pueda decidir qué hacer.</w:t>
       </w:r>
     </w:p>
     <w:p>

</xml_diff>